<commit_message>
Criado toda a estrutura para a Seismic Data Window acessar os dados. Agora a Seimic Data Window ja tem todo acesso aos dados
</commit_message>
<xml_diff>
--- a/docs/Estrutura da Seismic Data Window.docx
+++ b/docs/Estrutura da Seismic Data Window.docx
@@ -26,7 +26,7 @@
           <w:noProof/>
         </w:rPr>
         <w:drawing>
-          <wp:inline distT="0" distB="0" distL="0" distR="0" wp14:anchorId="2CDC0CE0" wp14:editId="66B627D4">
+          <wp:inline distT="0" distB="0" distL="0" distR="0" wp14:anchorId="2CDC0CE0" wp14:editId="4AF40AFC">
             <wp:extent cx="6108700" cy="3120957"/>
             <wp:effectExtent l="0" t="0" r="6350" b="3810"/>
             <wp:docPr id="1384609778" name="Imagem 1"/>
@@ -949,6 +949,913 @@
     </w:p>
     <w:p>
       <w:pPr>
+        <w:jc w:val="center"/>
+        <w:rPr>
+          <w:noProof/>
+        </w:rPr>
+      </w:pPr>
+    </w:p>
+    <w:p>
+      <w:pPr>
+        <w:rPr>
+          <w:noProof/>
+        </w:rPr>
+      </w:pPr>
+      <w:r>
+        <w:rPr>
+          <w:noProof/>
+        </w:rPr>
+        <w:br w:type="page"/>
+      </w:r>
+    </w:p>
+    <w:p>
+      <w:pPr>
+        <w:jc w:val="center"/>
+        <w:rPr>
+          <w:noProof/>
+        </w:rPr>
+      </w:pPr>
+      <w:r>
+        <w:rPr>
+          <w:noProof/>
+        </w:rPr>
+        <w:lastRenderedPageBreak/>
+        <w:t>FINALIZAÇÃO</w:t>
+      </w:r>
+    </w:p>
+    <w:p>
+      <w:pPr>
+        <w:jc w:val="both"/>
+        <w:rPr>
+          <w:noProof/>
+        </w:rPr>
+      </w:pPr>
+      <w:r>
+        <w:rPr>
+          <w:noProof/>
+        </w:rPr>
+        <w:t>Após pensar na Seismic Data Window, decidi que a funcionalidade mais importante dela é o acesso ao dados do arquivo segy</w:t>
+      </w:r>
+      <w:r>
+        <w:rPr>
+          <w:noProof/>
+        </w:rPr>
+        <w:t>, tambem criei um widget basico com a assinatura do sincronismo horizontal com a data window, o viewpor</w:t>
+      </w:r>
+      <w:r>
+        <w:rPr>
+          <w:noProof/>
+        </w:rPr>
+        <w:t xml:space="preserve">t será um único objeto compartilhado entre todos os filhos do </w:t>
+      </w:r>
+      <w:r>
+        <w:rPr>
+          <w:noProof/>
+        </w:rPr>
+        <w:t>HSynchronizedSeismicDataWidget</w:t>
+      </w:r>
+    </w:p>
+    <w:p>
+      <w:pPr>
+        <w:spacing w:after="0" w:line="240" w:lineRule="auto"/>
+        <w:rPr>
+          <w:rFonts w:ascii="Consolas" w:hAnsi="Consolas"/>
+          <w:noProof/>
+          <w:sz w:val="16"/>
+          <w:szCs w:val="16"/>
+        </w:rPr>
+      </w:pPr>
+      <w:r>
+        <w:rPr>
+          <w:rFonts w:ascii="Consolas" w:hAnsi="Consolas"/>
+          <w:noProof/>
+          <w:sz w:val="16"/>
+          <w:szCs w:val="16"/>
+        </w:rPr>
+        <w:t>__init__</w:t>
+      </w:r>
+    </w:p>
+    <w:p>
+      <w:pPr>
+        <w:spacing w:after="0" w:line="240" w:lineRule="auto"/>
+        <w:rPr>
+          <w:rFonts w:ascii="Consolas" w:hAnsi="Consolas"/>
+          <w:noProof/>
+          <w:sz w:val="16"/>
+          <w:szCs w:val="16"/>
+        </w:rPr>
+      </w:pPr>
+      <w:r>
+        <w:rPr>
+          <w:rFonts w:ascii="Consolas" w:hAnsi="Consolas"/>
+          <w:noProof/>
+          <w:sz w:val="16"/>
+          <w:szCs w:val="16"/>
+        </w:rPr>
+        <w:t xml:space="preserve">   │</w:t>
+      </w:r>
+    </w:p>
+    <w:p>
+      <w:pPr>
+        <w:spacing w:after="0" w:line="240" w:lineRule="auto"/>
+        <w:rPr>
+          <w:rFonts w:ascii="Consolas" w:hAnsi="Consolas"/>
+          <w:noProof/>
+          <w:sz w:val="16"/>
+          <w:szCs w:val="16"/>
+        </w:rPr>
+      </w:pPr>
+      <w:r>
+        <w:rPr>
+          <w:noProof/>
+          <w:sz w:val="28"/>
+          <w:szCs w:val="28"/>
+        </w:rPr>
+        <w:drawing>
+          <wp:anchor distT="0" distB="0" distL="114300" distR="114300" simplePos="0" relativeHeight="251659264" behindDoc="0" locked="0" layoutInCell="1" allowOverlap="1" wp14:anchorId="4456050B" wp14:editId="783CAE34">
+            <wp:simplePos x="0" y="0"/>
+            <wp:positionH relativeFrom="margin">
+              <wp:posOffset>3039745</wp:posOffset>
+            </wp:positionH>
+            <wp:positionV relativeFrom="paragraph">
+              <wp:posOffset>82550</wp:posOffset>
+            </wp:positionV>
+            <wp:extent cx="2401570" cy="3296920"/>
+            <wp:effectExtent l="0" t="0" r="0" b="0"/>
+            <wp:wrapSquare wrapText="bothSides"/>
+            <wp:docPr id="746706483" name="Imagem 1"/>
+            <wp:cNvGraphicFramePr>
+              <a:graphicFrameLocks xmlns:a="http://schemas.openxmlformats.org/drawingml/2006/main" noChangeAspect="1"/>
+            </wp:cNvGraphicFramePr>
+            <a:graphic xmlns:a="http://schemas.openxmlformats.org/drawingml/2006/main">
+              <a:graphicData uri="http://schemas.openxmlformats.org/drawingml/2006/picture">
+                <pic:pic xmlns:pic="http://schemas.openxmlformats.org/drawingml/2006/picture">
+                  <pic:nvPicPr>
+                    <pic:cNvPr id="746706483" name=""/>
+                    <pic:cNvPicPr/>
+                  </pic:nvPicPr>
+                  <pic:blipFill>
+                    <a:blip r:embed="rId13">
+                      <a:extLst>
+                        <a:ext uri="{28A0092B-C50C-407E-A947-70E740481C1C}">
+                          <a14:useLocalDpi xmlns:a14="http://schemas.microsoft.com/office/drawing/2010/main" val="0"/>
+                        </a:ext>
+                      </a:extLst>
+                    </a:blip>
+                    <a:stretch>
+                      <a:fillRect/>
+                    </a:stretch>
+                  </pic:blipFill>
+                  <pic:spPr>
+                    <a:xfrm>
+                      <a:off x="0" y="0"/>
+                      <a:ext cx="2401570" cy="3296920"/>
+                    </a:xfrm>
+                    <a:prstGeom prst="rect">
+                      <a:avLst/>
+                    </a:prstGeom>
+                  </pic:spPr>
+                </pic:pic>
+              </a:graphicData>
+            </a:graphic>
+            <wp14:sizeRelH relativeFrom="margin">
+              <wp14:pctWidth>0</wp14:pctWidth>
+            </wp14:sizeRelH>
+            <wp14:sizeRelV relativeFrom="margin">
+              <wp14:pctHeight>0</wp14:pctHeight>
+            </wp14:sizeRelV>
+          </wp:anchor>
+        </w:drawing>
+      </w:r>
+      <w:r>
+        <w:rPr>
+          <w:rFonts w:ascii="Consolas" w:hAnsi="Consolas"/>
+          <w:noProof/>
+          <w:sz w:val="16"/>
+          <w:szCs w:val="16"/>
+        </w:rPr>
+        <w:t xml:space="preserve">   ├── cria SeismicViewport</w:t>
+      </w:r>
+    </w:p>
+    <w:p>
+      <w:pPr>
+        <w:spacing w:after="0" w:line="240" w:lineRule="auto"/>
+        <w:rPr>
+          <w:rFonts w:ascii="Consolas" w:hAnsi="Consolas"/>
+          <w:noProof/>
+          <w:sz w:val="16"/>
+          <w:szCs w:val="16"/>
+        </w:rPr>
+      </w:pPr>
+      <w:r>
+        <w:rPr>
+          <w:rFonts w:ascii="Consolas" w:hAnsi="Consolas"/>
+          <w:noProof/>
+          <w:sz w:val="16"/>
+          <w:szCs w:val="16"/>
+        </w:rPr>
+        <w:t xml:space="preserve">   │</w:t>
+      </w:r>
+    </w:p>
+    <w:p>
+      <w:pPr>
+        <w:spacing w:after="0" w:line="240" w:lineRule="auto"/>
+        <w:rPr>
+          <w:rFonts w:ascii="Consolas" w:hAnsi="Consolas"/>
+          <w:noProof/>
+          <w:sz w:val="16"/>
+          <w:szCs w:val="16"/>
+        </w:rPr>
+      </w:pPr>
+      <w:r>
+        <w:rPr>
+          <w:rFonts w:ascii="Consolas" w:hAnsi="Consolas"/>
+          <w:noProof/>
+          <w:sz w:val="16"/>
+          <w:szCs w:val="16"/>
+        </w:rPr>
+        <w:t xml:space="preserve">   ├── cria TraceHeaderView(viewport)</w:t>
+      </w:r>
+    </w:p>
+    <w:p>
+      <w:pPr>
+        <w:spacing w:after="0" w:line="240" w:lineRule="auto"/>
+        <w:rPr>
+          <w:rFonts w:ascii="Consolas" w:hAnsi="Consolas"/>
+          <w:noProof/>
+          <w:sz w:val="16"/>
+          <w:szCs w:val="16"/>
+          <w:lang w:val="en-US"/>
+        </w:rPr>
+      </w:pPr>
+      <w:r>
+        <w:rPr>
+          <w:rFonts w:ascii="Consolas" w:hAnsi="Consolas"/>
+          <w:noProof/>
+          <w:sz w:val="16"/>
+          <w:szCs w:val="16"/>
+        </w:rPr>
+        <w:t xml:space="preserve">   </w:t>
+      </w:r>
+      <w:r>
+        <w:rPr>
+          <w:rFonts w:ascii="Consolas" w:hAnsi="Consolas"/>
+          <w:noProof/>
+          <w:sz w:val="16"/>
+          <w:szCs w:val="16"/>
+          <w:lang w:val="en-US"/>
+        </w:rPr>
+        <w:t>├── cria SeismicDataSamplesView(viewport)</w:t>
+      </w:r>
+    </w:p>
+    <w:p>
+      <w:pPr>
+        <w:spacing w:after="0" w:line="240" w:lineRule="auto"/>
+        <w:rPr>
+          <w:rFonts w:ascii="Consolas" w:hAnsi="Consolas"/>
+          <w:noProof/>
+          <w:sz w:val="16"/>
+          <w:szCs w:val="16"/>
+          <w:lang w:val="en-US"/>
+        </w:rPr>
+      </w:pPr>
+      <w:r>
+        <w:rPr>
+          <w:rFonts w:ascii="Consolas" w:hAnsi="Consolas"/>
+          <w:noProof/>
+          <w:sz w:val="16"/>
+          <w:szCs w:val="16"/>
+          <w:lang w:val="en-US"/>
+        </w:rPr>
+        <w:t xml:space="preserve">   ├── cria TraceAttributeGraphView(viewport)</w:t>
+      </w:r>
+    </w:p>
+    <w:p>
+      <w:pPr>
+        <w:spacing w:after="0" w:line="240" w:lineRule="auto"/>
+        <w:rPr>
+          <w:rFonts w:ascii="Consolas" w:hAnsi="Consolas"/>
+          <w:noProof/>
+          <w:sz w:val="16"/>
+          <w:szCs w:val="16"/>
+          <w:lang w:val="en-US"/>
+        </w:rPr>
+      </w:pPr>
+      <w:r>
+        <w:rPr>
+          <w:rFonts w:ascii="Consolas" w:hAnsi="Consolas"/>
+          <w:noProof/>
+          <w:sz w:val="16"/>
+          <w:szCs w:val="16"/>
+          <w:lang w:val="en-US"/>
+        </w:rPr>
+        <w:t xml:space="preserve">   │</w:t>
+      </w:r>
+    </w:p>
+    <w:p>
+      <w:pPr>
+        <w:spacing w:after="0" w:line="240" w:lineRule="auto"/>
+        <w:rPr>
+          <w:rFonts w:ascii="Consolas" w:hAnsi="Consolas"/>
+          <w:noProof/>
+          <w:sz w:val="16"/>
+          <w:szCs w:val="16"/>
+          <w:lang w:val="en-US"/>
+        </w:rPr>
+      </w:pPr>
+      <w:r>
+        <w:rPr>
+          <w:rFonts w:ascii="Consolas" w:hAnsi="Consolas"/>
+          <w:noProof/>
+          <w:sz w:val="16"/>
+          <w:szCs w:val="16"/>
+          <w:lang w:val="en-US"/>
+        </w:rPr>
+        <w:t xml:space="preserve">   └── _initialize_display()</w:t>
+      </w:r>
+    </w:p>
+    <w:p>
+      <w:pPr>
+        <w:spacing w:after="0" w:line="240" w:lineRule="auto"/>
+        <w:rPr>
+          <w:rFonts w:ascii="Consolas" w:hAnsi="Consolas"/>
+          <w:noProof/>
+          <w:sz w:val="16"/>
+          <w:szCs w:val="16"/>
+          <w:lang w:val="en-US"/>
+        </w:rPr>
+      </w:pPr>
+      <w:r>
+        <w:rPr>
+          <w:rFonts w:ascii="Consolas" w:hAnsi="Consolas"/>
+          <w:noProof/>
+          <w:sz w:val="16"/>
+          <w:szCs w:val="16"/>
+          <w:lang w:val="en-US"/>
+        </w:rPr>
+        <w:t xml:space="preserve">              │</w:t>
+      </w:r>
+    </w:p>
+    <w:p>
+      <w:pPr>
+        <w:spacing w:after="0" w:line="240" w:lineRule="auto"/>
+        <w:rPr>
+          <w:rFonts w:ascii="Consolas" w:hAnsi="Consolas"/>
+          <w:noProof/>
+          <w:sz w:val="16"/>
+          <w:szCs w:val="16"/>
+          <w:lang w:val="en-US"/>
+        </w:rPr>
+      </w:pPr>
+      <w:r>
+        <w:rPr>
+          <w:rFonts w:ascii="Consolas" w:hAnsi="Consolas"/>
+          <w:noProof/>
+          <w:sz w:val="16"/>
+          <w:szCs w:val="16"/>
+          <w:lang w:val="en-US"/>
+        </w:rPr>
+        <w:t xml:space="preserve">              ▼</w:t>
+      </w:r>
+    </w:p>
+    <w:p>
+      <w:pPr>
+        <w:spacing w:after="0" w:line="240" w:lineRule="auto"/>
+        <w:rPr>
+          <w:rFonts w:ascii="Consolas" w:hAnsi="Consolas"/>
+          <w:noProof/>
+          <w:sz w:val="16"/>
+          <w:szCs w:val="16"/>
+          <w:lang w:val="en-US"/>
+        </w:rPr>
+      </w:pPr>
+      <w:r>
+        <w:rPr>
+          <w:rFonts w:ascii="Consolas" w:hAnsi="Consolas"/>
+          <w:noProof/>
+          <w:sz w:val="16"/>
+          <w:szCs w:val="16"/>
+          <w:lang w:val="en-US"/>
+        </w:rPr>
+        <w:t xml:space="preserve">        use_cases.open(path)</w:t>
+      </w:r>
+    </w:p>
+    <w:p>
+      <w:pPr>
+        <w:spacing w:after="0" w:line="240" w:lineRule="auto"/>
+        <w:rPr>
+          <w:rFonts w:ascii="Consolas" w:hAnsi="Consolas"/>
+          <w:noProof/>
+          <w:sz w:val="16"/>
+          <w:szCs w:val="16"/>
+        </w:rPr>
+      </w:pPr>
+      <w:r>
+        <w:rPr>
+          <w:rFonts w:ascii="Consolas" w:hAnsi="Consolas"/>
+          <w:noProof/>
+          <w:sz w:val="16"/>
+          <w:szCs w:val="16"/>
+          <w:lang w:val="en-US"/>
+        </w:rPr>
+        <w:t xml:space="preserve">              </w:t>
+      </w:r>
+      <w:r>
+        <w:rPr>
+          <w:rFonts w:ascii="Consolas" w:hAnsi="Consolas"/>
+          <w:noProof/>
+          <w:sz w:val="16"/>
+          <w:szCs w:val="16"/>
+        </w:rPr>
+        <w:t>│</w:t>
+      </w:r>
+    </w:p>
+    <w:p>
+      <w:pPr>
+        <w:spacing w:after="0" w:line="240" w:lineRule="auto"/>
+        <w:rPr>
+          <w:rFonts w:ascii="Consolas" w:hAnsi="Consolas"/>
+          <w:noProof/>
+          <w:sz w:val="16"/>
+          <w:szCs w:val="16"/>
+        </w:rPr>
+      </w:pPr>
+      <w:r>
+        <w:rPr>
+          <w:rFonts w:ascii="Consolas" w:hAnsi="Consolas"/>
+          <w:noProof/>
+          <w:sz w:val="16"/>
+          <w:szCs w:val="16"/>
+        </w:rPr>
+        <w:t xml:space="preserve">              ▼</w:t>
+      </w:r>
+    </w:p>
+    <w:p>
+      <w:pPr>
+        <w:spacing w:after="0" w:line="240" w:lineRule="auto"/>
+        <w:rPr>
+          <w:rFonts w:ascii="Consolas" w:hAnsi="Consolas"/>
+          <w:noProof/>
+          <w:sz w:val="16"/>
+          <w:szCs w:val="16"/>
+        </w:rPr>
+      </w:pPr>
+      <w:r>
+        <w:rPr>
+          <w:rFonts w:ascii="Consolas" w:hAnsi="Consolas"/>
+          <w:noProof/>
+          <w:sz w:val="16"/>
+          <w:szCs w:val="16"/>
+        </w:rPr>
+        <w:t xml:space="preserve">       SeismicWindowInfoDTO</w:t>
+      </w:r>
+    </w:p>
+    <w:p>
+      <w:pPr>
+        <w:spacing w:after="0" w:line="240" w:lineRule="auto"/>
+        <w:rPr>
+          <w:rFonts w:ascii="Consolas" w:hAnsi="Consolas"/>
+          <w:noProof/>
+          <w:sz w:val="16"/>
+          <w:szCs w:val="16"/>
+        </w:rPr>
+      </w:pPr>
+      <w:r>
+        <w:rPr>
+          <w:rFonts w:ascii="Consolas" w:hAnsi="Consolas"/>
+          <w:noProof/>
+          <w:sz w:val="16"/>
+          <w:szCs w:val="16"/>
+        </w:rPr>
+        <w:t xml:space="preserve">              │</w:t>
+      </w:r>
+    </w:p>
+    <w:p>
+      <w:pPr>
+        <w:spacing w:after="0" w:line="240" w:lineRule="auto"/>
+        <w:rPr>
+          <w:rFonts w:ascii="Consolas" w:hAnsi="Consolas"/>
+          <w:noProof/>
+          <w:sz w:val="16"/>
+          <w:szCs w:val="16"/>
+        </w:rPr>
+      </w:pPr>
+      <w:r>
+        <w:rPr>
+          <w:rFonts w:ascii="Consolas" w:hAnsi="Consolas"/>
+          <w:noProof/>
+          <w:sz w:val="16"/>
+          <w:szCs w:val="16"/>
+        </w:rPr>
+        <w:t xml:space="preserve">              ├── trace_count</w:t>
+      </w:r>
+    </w:p>
+    <w:p>
+      <w:pPr>
+        <w:spacing w:after="0" w:line="240" w:lineRule="auto"/>
+        <w:rPr>
+          <w:rFonts w:ascii="Consolas" w:hAnsi="Consolas"/>
+          <w:noProof/>
+          <w:sz w:val="16"/>
+          <w:szCs w:val="16"/>
+        </w:rPr>
+      </w:pPr>
+      <w:r>
+        <w:rPr>
+          <w:rFonts w:ascii="Consolas" w:hAnsi="Consolas"/>
+          <w:noProof/>
+          <w:sz w:val="16"/>
+          <w:szCs w:val="16"/>
+        </w:rPr>
+        <w:t xml:space="preserve">              ├── sample_count</w:t>
+      </w:r>
+    </w:p>
+    <w:p>
+      <w:pPr>
+        <w:spacing w:after="0" w:line="240" w:lineRule="auto"/>
+        <w:rPr>
+          <w:rFonts w:ascii="Consolas" w:hAnsi="Consolas"/>
+          <w:noProof/>
+          <w:sz w:val="16"/>
+          <w:szCs w:val="16"/>
+          <w:lang w:val="en-US"/>
+        </w:rPr>
+      </w:pPr>
+      <w:r>
+        <w:rPr>
+          <w:rFonts w:ascii="Consolas" w:hAnsi="Consolas"/>
+          <w:noProof/>
+          <w:sz w:val="16"/>
+          <w:szCs w:val="16"/>
+        </w:rPr>
+        <w:t xml:space="preserve">              </w:t>
+      </w:r>
+      <w:r>
+        <w:rPr>
+          <w:rFonts w:ascii="Consolas" w:hAnsi="Consolas"/>
+          <w:noProof/>
+          <w:sz w:val="16"/>
+          <w:szCs w:val="16"/>
+          <w:lang w:val="en-US"/>
+        </w:rPr>
+        <w:t>├── sample_interval</w:t>
+      </w:r>
+    </w:p>
+    <w:p>
+      <w:pPr>
+        <w:spacing w:after="0" w:line="240" w:lineRule="auto"/>
+        <w:rPr>
+          <w:rFonts w:ascii="Consolas" w:hAnsi="Consolas"/>
+          <w:noProof/>
+          <w:sz w:val="16"/>
+          <w:szCs w:val="16"/>
+          <w:lang w:val="en-US"/>
+        </w:rPr>
+      </w:pPr>
+      <w:r>
+        <w:rPr>
+          <w:rFonts w:ascii="Consolas" w:hAnsi="Consolas"/>
+          <w:noProof/>
+          <w:sz w:val="16"/>
+          <w:szCs w:val="16"/>
+          <w:lang w:val="en-US"/>
+        </w:rPr>
+        <w:t xml:space="preserve">              └── record_length</w:t>
+      </w:r>
+    </w:p>
+    <w:p>
+      <w:pPr>
+        <w:spacing w:after="0" w:line="240" w:lineRule="auto"/>
+        <w:rPr>
+          <w:rFonts w:ascii="Consolas" w:hAnsi="Consolas"/>
+          <w:noProof/>
+          <w:sz w:val="16"/>
+          <w:szCs w:val="16"/>
+          <w:lang w:val="en-US"/>
+        </w:rPr>
+      </w:pPr>
+      <w:r>
+        <w:rPr>
+          <w:rFonts w:ascii="Consolas" w:hAnsi="Consolas"/>
+          <w:noProof/>
+          <w:sz w:val="16"/>
+          <w:szCs w:val="16"/>
+          <w:lang w:val="en-US"/>
+        </w:rPr>
+        <w:t xml:space="preserve">              │</w:t>
+      </w:r>
+    </w:p>
+    <w:p>
+      <w:pPr>
+        <w:spacing w:after="0" w:line="240" w:lineRule="auto"/>
+        <w:rPr>
+          <w:rFonts w:ascii="Consolas" w:hAnsi="Consolas"/>
+          <w:noProof/>
+          <w:sz w:val="16"/>
+          <w:szCs w:val="16"/>
+          <w:lang w:val="en-US"/>
+        </w:rPr>
+      </w:pPr>
+      <w:r>
+        <w:rPr>
+          <w:rFonts w:ascii="Consolas" w:hAnsi="Consolas"/>
+          <w:noProof/>
+          <w:sz w:val="16"/>
+          <w:szCs w:val="16"/>
+          <w:lang w:val="en-US"/>
+        </w:rPr>
+        <w:t xml:space="preserve">              ▼</w:t>
+      </w:r>
+    </w:p>
+    <w:p>
+      <w:pPr>
+        <w:spacing w:after="0" w:line="240" w:lineRule="auto"/>
+        <w:rPr>
+          <w:rFonts w:ascii="Consolas" w:hAnsi="Consolas"/>
+          <w:noProof/>
+          <w:sz w:val="16"/>
+          <w:szCs w:val="16"/>
+          <w:lang w:val="en-US"/>
+        </w:rPr>
+      </w:pPr>
+      <w:r>
+        <w:rPr>
+          <w:rFonts w:ascii="Consolas" w:hAnsi="Consolas"/>
+          <w:noProof/>
+          <w:sz w:val="16"/>
+          <w:szCs w:val="16"/>
+          <w:lang w:val="en-US"/>
+        </w:rPr>
+        <w:t xml:space="preserve">        configura viewport</w:t>
+      </w:r>
+    </w:p>
+    <w:p>
+      <w:pPr>
+        <w:spacing w:after="0" w:line="240" w:lineRule="auto"/>
+        <w:rPr>
+          <w:rFonts w:ascii="Consolas" w:hAnsi="Consolas"/>
+          <w:noProof/>
+          <w:sz w:val="16"/>
+          <w:szCs w:val="16"/>
+          <w:lang w:val="en-US"/>
+        </w:rPr>
+      </w:pPr>
+      <w:r>
+        <w:rPr>
+          <w:rFonts w:ascii="Consolas" w:hAnsi="Consolas"/>
+          <w:noProof/>
+          <w:sz w:val="16"/>
+          <w:szCs w:val="16"/>
+          <w:lang w:val="en-US"/>
+        </w:rPr>
+        <w:t xml:space="preserve">              │</w:t>
+      </w:r>
+    </w:p>
+    <w:p>
+      <w:pPr>
+        <w:spacing w:after="0" w:line="240" w:lineRule="auto"/>
+        <w:rPr>
+          <w:rFonts w:ascii="Consolas" w:hAnsi="Consolas"/>
+          <w:noProof/>
+          <w:sz w:val="16"/>
+          <w:szCs w:val="16"/>
+          <w:lang w:val="en-US"/>
+        </w:rPr>
+      </w:pPr>
+      <w:r>
+        <w:rPr>
+          <w:rFonts w:ascii="Consolas" w:hAnsi="Consolas"/>
+          <w:noProof/>
+          <w:sz w:val="16"/>
+          <w:szCs w:val="16"/>
+          <w:lang w:val="en-US"/>
+        </w:rPr>
+        <w:t xml:space="preserve">              ▼</w:t>
+      </w:r>
+    </w:p>
+    <w:p>
+      <w:pPr>
+        <w:spacing w:after="0" w:line="240" w:lineRule="auto"/>
+        <w:rPr>
+          <w:rFonts w:ascii="Consolas" w:hAnsi="Consolas"/>
+          <w:noProof/>
+          <w:sz w:val="16"/>
+          <w:szCs w:val="16"/>
+          <w:lang w:val="en-US"/>
+        </w:rPr>
+      </w:pPr>
+      <w:r>
+        <w:rPr>
+          <w:rFonts w:ascii="Consolas" w:hAnsi="Consolas"/>
+          <w:noProof/>
+          <w:sz w:val="16"/>
+          <w:szCs w:val="16"/>
+          <w:lang w:val="en-US"/>
+        </w:rPr>
+        <w:t xml:space="preserve">      _request_current_data()</w:t>
+      </w:r>
+    </w:p>
+    <w:p>
+      <w:pPr>
+        <w:spacing w:after="0" w:line="240" w:lineRule="auto"/>
+        <w:rPr>
+          <w:rFonts w:ascii="Consolas" w:hAnsi="Consolas"/>
+          <w:noProof/>
+          <w:sz w:val="16"/>
+          <w:szCs w:val="16"/>
+          <w:lang w:val="en-US"/>
+        </w:rPr>
+      </w:pPr>
+      <w:r>
+        <w:rPr>
+          <w:rFonts w:ascii="Consolas" w:hAnsi="Consolas"/>
+          <w:noProof/>
+          <w:sz w:val="16"/>
+          <w:szCs w:val="16"/>
+          <w:lang w:val="en-US"/>
+        </w:rPr>
+        <w:t xml:space="preserve">              │</w:t>
+      </w:r>
+    </w:p>
+    <w:p>
+      <w:pPr>
+        <w:spacing w:after="0" w:line="240" w:lineRule="auto"/>
+        <w:rPr>
+          <w:rFonts w:ascii="Consolas" w:hAnsi="Consolas"/>
+          <w:noProof/>
+          <w:sz w:val="16"/>
+          <w:szCs w:val="16"/>
+          <w:lang w:val="en-US"/>
+        </w:rPr>
+      </w:pPr>
+      <w:r>
+        <w:rPr>
+          <w:rFonts w:ascii="Consolas" w:hAnsi="Consolas"/>
+          <w:noProof/>
+          <w:sz w:val="16"/>
+          <w:szCs w:val="16"/>
+          <w:lang w:val="en-US"/>
+        </w:rPr>
+        <w:t xml:space="preserve">              ▼</w:t>
+      </w:r>
+    </w:p>
+    <w:p>
+      <w:pPr>
+        <w:spacing w:after="0" w:line="240" w:lineRule="auto"/>
+        <w:rPr>
+          <w:rFonts w:ascii="Consolas" w:hAnsi="Consolas"/>
+          <w:noProof/>
+          <w:sz w:val="16"/>
+          <w:szCs w:val="16"/>
+          <w:lang w:val="en-US"/>
+        </w:rPr>
+      </w:pPr>
+      <w:r>
+        <w:rPr>
+          <w:rFonts w:ascii="Consolas" w:hAnsi="Consolas"/>
+          <w:noProof/>
+          <w:sz w:val="16"/>
+          <w:szCs w:val="16"/>
+          <w:lang w:val="en-US"/>
+        </w:rPr>
+        <w:t xml:space="preserve">      use_cases.load_data(...)</w:t>
+      </w:r>
+    </w:p>
+    <w:p>
+      <w:pPr>
+        <w:spacing w:after="0" w:line="240" w:lineRule="auto"/>
+        <w:rPr>
+          <w:rFonts w:ascii="Consolas" w:hAnsi="Consolas"/>
+          <w:noProof/>
+          <w:sz w:val="16"/>
+          <w:szCs w:val="16"/>
+        </w:rPr>
+      </w:pPr>
+      <w:r>
+        <w:rPr>
+          <w:rFonts w:ascii="Consolas" w:hAnsi="Consolas"/>
+          <w:noProof/>
+          <w:sz w:val="16"/>
+          <w:szCs w:val="16"/>
+          <w:lang w:val="en-US"/>
+        </w:rPr>
+        <w:t xml:space="preserve">              </w:t>
+      </w:r>
+      <w:r>
+        <w:rPr>
+          <w:rFonts w:ascii="Consolas" w:hAnsi="Consolas"/>
+          <w:noProof/>
+          <w:sz w:val="16"/>
+          <w:szCs w:val="16"/>
+        </w:rPr>
+        <w:t>│</w:t>
+      </w:r>
+    </w:p>
+    <w:p>
+      <w:pPr>
+        <w:spacing w:after="0" w:line="240" w:lineRule="auto"/>
+        <w:rPr>
+          <w:rFonts w:ascii="Consolas" w:hAnsi="Consolas"/>
+          <w:noProof/>
+          <w:sz w:val="16"/>
+          <w:szCs w:val="16"/>
+        </w:rPr>
+      </w:pPr>
+      <w:r>
+        <w:rPr>
+          <w:rFonts w:ascii="Consolas" w:hAnsi="Consolas"/>
+          <w:noProof/>
+          <w:sz w:val="16"/>
+          <w:szCs w:val="16"/>
+        </w:rPr>
+        <w:t xml:space="preserve">              ▼</w:t>
+      </w:r>
+    </w:p>
+    <w:p>
+      <w:pPr>
+        <w:spacing w:after="0" w:line="240" w:lineRule="auto"/>
+        <w:rPr>
+          <w:rFonts w:ascii="Consolas" w:hAnsi="Consolas"/>
+          <w:noProof/>
+          <w:sz w:val="16"/>
+          <w:szCs w:val="16"/>
+        </w:rPr>
+      </w:pPr>
+      <w:r>
+        <w:rPr>
+          <w:rFonts w:ascii="Consolas" w:hAnsi="Consolas"/>
+          <w:noProof/>
+          <w:sz w:val="16"/>
+          <w:szCs w:val="16"/>
+        </w:rPr>
+        <w:t xml:space="preserve">       SeismicDataBlockDTO</w:t>
+      </w:r>
+    </w:p>
+    <w:p>
+      <w:pPr>
+        <w:spacing w:after="0" w:line="240" w:lineRule="auto"/>
+        <w:rPr>
+          <w:rFonts w:ascii="Consolas" w:hAnsi="Consolas"/>
+          <w:noProof/>
+          <w:sz w:val="16"/>
+          <w:szCs w:val="16"/>
+        </w:rPr>
+      </w:pPr>
+      <w:r>
+        <w:rPr>
+          <w:rFonts w:ascii="Consolas" w:hAnsi="Consolas"/>
+          <w:noProof/>
+          <w:sz w:val="16"/>
+          <w:szCs w:val="16"/>
+        </w:rPr>
+        <w:t xml:space="preserve">              │</w:t>
+      </w:r>
+    </w:p>
+    <w:p>
+      <w:pPr>
+        <w:spacing w:after="0" w:line="240" w:lineRule="auto"/>
+        <w:rPr>
+          <w:rFonts w:ascii="Consolas" w:hAnsi="Consolas"/>
+          <w:noProof/>
+          <w:sz w:val="16"/>
+          <w:szCs w:val="16"/>
+        </w:rPr>
+      </w:pPr>
+      <w:r>
+        <w:rPr>
+          <w:rFonts w:ascii="Consolas" w:hAnsi="Consolas"/>
+          <w:noProof/>
+          <w:sz w:val="16"/>
+          <w:szCs w:val="16"/>
+        </w:rPr>
+        <w:t xml:space="preserve">              ▼</w:t>
+      </w:r>
+    </w:p>
+    <w:p>
+      <w:pPr>
+        <w:spacing w:after="0" w:line="240" w:lineRule="auto"/>
+        <w:rPr>
+          <w:noProof/>
+        </w:rPr>
+      </w:pPr>
+      <w:r>
+        <w:rPr>
+          <w:rFonts w:ascii="Consolas" w:hAnsi="Consolas"/>
+          <w:noProof/>
+          <w:sz w:val="16"/>
+          <w:szCs w:val="16"/>
+        </w:rPr>
+        <w:t xml:space="preserve">        _distribute_data()</w:t>
+      </w:r>
+      <w:r>
+        <w:rPr>
+          <w:noProof/>
+        </w:rPr>
+        <w:br w:type="page"/>
+      </w:r>
+    </w:p>
+    <w:p>
+      <w:pPr>
         <w:ind w:firstLine="567"/>
         <w:jc w:val="center"/>
         <w:rPr>
@@ -959,6 +1866,7 @@
         <w:rPr>
           <w:noProof/>
         </w:rPr>
+        <w:lastRenderedPageBreak/>
         <w:t>IDEIAS DE FUNCIONALIDADES</w:t>
       </w:r>
     </w:p>
@@ -982,6 +1890,14 @@
           <w:noProof/>
         </w:rPr>
         <w:t>Fluxo de Processamento</w:t>
+      </w:r>
+      <w:r>
+        <w:rPr>
+          <w:b/>
+          <w:bCs/>
+          <w:noProof/>
+        </w:rPr>
+        <w:t xml:space="preserve"> (esta funcionalidade sera para a versão de analise)</w:t>
       </w:r>
     </w:p>
     <w:p>
@@ -1110,7 +2026,7 @@
                     <pic:cNvPicPr/>
                   </pic:nvPicPr>
                   <pic:blipFill>
-                    <a:blip r:embed="rId13" cstate="print">
+                    <a:blip r:embed="rId14" cstate="print">
                       <a:extLst>
                         <a:ext uri="{28A0092B-C50C-407E-A947-70E740481C1C}">
                           <a14:useLocalDpi xmlns:a14="http://schemas.microsoft.com/office/drawing/2010/main" val="0"/>
@@ -1177,7 +2093,7 @@
                     </pic:cNvPicPr>
                   </pic:nvPicPr>
                   <pic:blipFill>
-                    <a:blip r:embed="rId14">
+                    <a:blip r:embed="rId15">
                       <a:extLst>
                         <a:ext uri="{28A0092B-C50C-407E-A947-70E740481C1C}">
                           <a14:useLocalDpi xmlns:a14="http://schemas.microsoft.com/office/drawing/2010/main" val="0"/>
@@ -1219,24 +2135,14 @@
       <w:r>
         <w:t xml:space="preserve">Figura </w:t>
       </w:r>
-      <w:r>
-        <w:fldChar w:fldCharType="begin"/>
-      </w:r>
-      <w:r>
-        <w:instrText xml:space="preserve"> SEQ Figura \* ARABIC </w:instrText>
-      </w:r>
-      <w:r>
-        <w:fldChar w:fldCharType="separate"/>
-      </w:r>
-      <w:r>
-        <w:rPr>
-          <w:noProof/>
-        </w:rPr>
-        <w:t>1</w:t>
-      </w:r>
-      <w:r>
-        <w:fldChar w:fldCharType="end"/>
-      </w:r>
+      <w:fldSimple w:instr=" SEQ Figura \* ARABIC ">
+        <w:r>
+          <w:rPr>
+            <w:noProof/>
+          </w:rPr>
+          <w:t>1</w:t>
+        </w:r>
+      </w:fldSimple>
       <w:r>
         <w:t>-Desenho inicial (croqui) da Seismic Data Window</w:t>
       </w:r>
@@ -2368,7 +3274,6 @@
   <w:style w:type="character" w:default="1" w:styleId="Fontepargpadro">
     <w:name w:val="Default Paragraph Font"/>
     <w:uiPriority w:val="1"/>
-    <w:semiHidden/>
     <w:unhideWhenUsed/>
   </w:style>
   <w:style w:type="table" w:default="1" w:styleId="Tabelanormal">
@@ -2701,6 +3606,36 @@
       <w:szCs w:val="18"/>
     </w:rPr>
   </w:style>
+  <w:style w:type="paragraph" w:styleId="Pr-formataoHTML">
+    <w:name w:val="HTML Preformatted"/>
+    <w:basedOn w:val="Normal"/>
+    <w:link w:val="Pr-formataoHTMLChar"/>
+    <w:uiPriority w:val="99"/>
+    <w:semiHidden/>
+    <w:unhideWhenUsed/>
+    <w:rsid w:val="00747876"/>
+    <w:pPr>
+      <w:spacing w:after="0" w:line="240" w:lineRule="auto"/>
+    </w:pPr>
+    <w:rPr>
+      <w:rFonts w:ascii="Consolas" w:hAnsi="Consolas"/>
+      <w:sz w:val="20"/>
+      <w:szCs w:val="20"/>
+    </w:rPr>
+  </w:style>
+  <w:style w:type="character" w:customStyle="1" w:styleId="Pr-formataoHTMLChar">
+    <w:name w:val="Pré-formatação HTML Char"/>
+    <w:basedOn w:val="Fontepargpadro"/>
+    <w:link w:val="Pr-formataoHTML"/>
+    <w:uiPriority w:val="99"/>
+    <w:semiHidden/>
+    <w:rsid w:val="00747876"/>
+    <w:rPr>
+      <w:rFonts w:ascii="Consolas" w:hAnsi="Consolas"/>
+      <w:sz w:val="20"/>
+      <w:szCs w:val="20"/>
+    </w:rPr>
+  </w:style>
 </w:styles>
 </file>
 

</xml_diff>

<commit_message>
O Qwidget TraceAttribeGraphView esta quase finalizado, falta o metodo de mousemove
</commit_message>
<xml_diff>
--- a/docs/Estrutura da Seismic Data Window.docx
+++ b/docs/Estrutura da Seismic Data Window.docx
@@ -1185,6 +1185,55 @@
           <w:noProof/>
           <w:sz w:val="16"/>
           <w:szCs w:val="16"/>
+        </w:rPr>
+      </w:pPr>
+      <w:r>
+        <w:rPr>
+          <w:rFonts w:ascii="Consolas" w:hAnsi="Consolas"/>
+          <w:noProof/>
+          <w:sz w:val="16"/>
+          <w:szCs w:val="16"/>
+        </w:rPr>
+        <w:t xml:space="preserve">   </w:t>
+      </w:r>
+      <w:r>
+        <w:rPr>
+          <w:rFonts w:ascii="Consolas" w:hAnsi="Consolas"/>
+          <w:noProof/>
+          <w:sz w:val="16"/>
+          <w:szCs w:val="16"/>
+        </w:rPr>
+        <w:t>├── cria SeismicDataSamplesView(viewport)</w:t>
+      </w:r>
+    </w:p>
+    <w:p>
+      <w:pPr>
+        <w:spacing w:after="0" w:line="240" w:lineRule="auto"/>
+        <w:rPr>
+          <w:rFonts w:ascii="Consolas" w:hAnsi="Consolas"/>
+          <w:noProof/>
+          <w:sz w:val="16"/>
+          <w:szCs w:val="16"/>
+        </w:rPr>
+      </w:pPr>
+      <w:r>
+        <w:rPr>
+          <w:rFonts w:ascii="Consolas" w:hAnsi="Consolas"/>
+          <w:noProof/>
+          <w:sz w:val="16"/>
+          <w:szCs w:val="16"/>
+        </w:rPr>
+        <w:t xml:space="preserve">   ├── cria TraceAttributeGraphView(viewport)</w:t>
+      </w:r>
+    </w:p>
+    <w:p>
+      <w:pPr>
+        <w:spacing w:after="0" w:line="240" w:lineRule="auto"/>
+        <w:rPr>
+          <w:rFonts w:ascii="Consolas" w:hAnsi="Consolas"/>
+          <w:noProof/>
+          <w:sz w:val="16"/>
+          <w:szCs w:val="16"/>
           <w:lang w:val="en-US"/>
         </w:rPr>
       </w:pPr>
@@ -1205,7 +1254,7 @@
           <w:szCs w:val="16"/>
           <w:lang w:val="en-US"/>
         </w:rPr>
-        <w:t>├── cria SeismicDataSamplesView(viewport)</w:t>
+        <w:t>│</w:t>
       </w:r>
     </w:p>
     <w:p>
@@ -1227,7 +1276,7 @@
           <w:szCs w:val="16"/>
           <w:lang w:val="en-US"/>
         </w:rPr>
-        <w:t xml:space="preserve">   ├── cria TraceAttributeGraphView(viewport)</w:t>
+        <w:t xml:space="preserve">   └── _initialize_display()</w:t>
       </w:r>
     </w:p>
     <w:p>
@@ -1249,7 +1298,7 @@
           <w:szCs w:val="16"/>
           <w:lang w:val="en-US"/>
         </w:rPr>
-        <w:t xml:space="preserve">   │</w:t>
+        <w:t xml:space="preserve">              │</w:t>
       </w:r>
     </w:p>
     <w:p>
@@ -1271,7 +1320,7 @@
           <w:szCs w:val="16"/>
           <w:lang w:val="en-US"/>
         </w:rPr>
-        <w:t xml:space="preserve">   └── _initialize_display()</w:t>
+        <w:t xml:space="preserve">              ▼</w:t>
       </w:r>
     </w:p>
     <w:p>
@@ -1293,6 +1342,96 @@
           <w:szCs w:val="16"/>
           <w:lang w:val="en-US"/>
         </w:rPr>
+        <w:t xml:space="preserve">        use_cases.open(path)</w:t>
+      </w:r>
+    </w:p>
+    <w:p>
+      <w:pPr>
+        <w:spacing w:after="0" w:line="240" w:lineRule="auto"/>
+        <w:rPr>
+          <w:rFonts w:ascii="Consolas" w:hAnsi="Consolas"/>
+          <w:noProof/>
+          <w:sz w:val="16"/>
+          <w:szCs w:val="16"/>
+        </w:rPr>
+      </w:pPr>
+      <w:r>
+        <w:rPr>
+          <w:rFonts w:ascii="Consolas" w:hAnsi="Consolas"/>
+          <w:noProof/>
+          <w:sz w:val="16"/>
+          <w:szCs w:val="16"/>
+          <w:lang w:val="en-US"/>
+        </w:rPr>
+        <w:t xml:space="preserve">              </w:t>
+      </w:r>
+      <w:r>
+        <w:rPr>
+          <w:rFonts w:ascii="Consolas" w:hAnsi="Consolas"/>
+          <w:noProof/>
+          <w:sz w:val="16"/>
+          <w:szCs w:val="16"/>
+        </w:rPr>
+        <w:t>│</w:t>
+      </w:r>
+    </w:p>
+    <w:p>
+      <w:pPr>
+        <w:spacing w:after="0" w:line="240" w:lineRule="auto"/>
+        <w:rPr>
+          <w:rFonts w:ascii="Consolas" w:hAnsi="Consolas"/>
+          <w:noProof/>
+          <w:sz w:val="16"/>
+          <w:szCs w:val="16"/>
+        </w:rPr>
+      </w:pPr>
+      <w:r>
+        <w:rPr>
+          <w:rFonts w:ascii="Consolas" w:hAnsi="Consolas"/>
+          <w:noProof/>
+          <w:sz w:val="16"/>
+          <w:szCs w:val="16"/>
+        </w:rPr>
+        <w:t xml:space="preserve">              ▼</w:t>
+      </w:r>
+    </w:p>
+    <w:p>
+      <w:pPr>
+        <w:spacing w:after="0" w:line="240" w:lineRule="auto"/>
+        <w:rPr>
+          <w:rFonts w:ascii="Consolas" w:hAnsi="Consolas"/>
+          <w:noProof/>
+          <w:sz w:val="16"/>
+          <w:szCs w:val="16"/>
+        </w:rPr>
+      </w:pPr>
+      <w:r>
+        <w:rPr>
+          <w:rFonts w:ascii="Consolas" w:hAnsi="Consolas"/>
+          <w:noProof/>
+          <w:sz w:val="16"/>
+          <w:szCs w:val="16"/>
+        </w:rPr>
+        <w:t xml:space="preserve">       SeismicWindowInfoDTO</w:t>
+      </w:r>
+    </w:p>
+    <w:p>
+      <w:pPr>
+        <w:spacing w:after="0" w:line="240" w:lineRule="auto"/>
+        <w:rPr>
+          <w:rFonts w:ascii="Consolas" w:hAnsi="Consolas"/>
+          <w:noProof/>
+          <w:sz w:val="16"/>
+          <w:szCs w:val="16"/>
+        </w:rPr>
+      </w:pPr>
+      <w:r>
+        <w:rPr>
+          <w:rFonts w:ascii="Consolas" w:hAnsi="Consolas"/>
+          <w:noProof/>
+          <w:sz w:val="16"/>
+          <w:szCs w:val="16"/>
+        </w:rPr>
         <w:t xml:space="preserve">              │</w:t>
       </w:r>
     </w:p>
@@ -1304,6 +1443,46 @@
           <w:noProof/>
           <w:sz w:val="16"/>
           <w:szCs w:val="16"/>
+        </w:rPr>
+      </w:pPr>
+      <w:r>
+        <w:rPr>
+          <w:rFonts w:ascii="Consolas" w:hAnsi="Consolas"/>
+          <w:noProof/>
+          <w:sz w:val="16"/>
+          <w:szCs w:val="16"/>
+        </w:rPr>
+        <w:t xml:space="preserve">              ├── trace_count</w:t>
+      </w:r>
+    </w:p>
+    <w:p>
+      <w:pPr>
+        <w:spacing w:after="0" w:line="240" w:lineRule="auto"/>
+        <w:rPr>
+          <w:rFonts w:ascii="Consolas" w:hAnsi="Consolas"/>
+          <w:noProof/>
+          <w:sz w:val="16"/>
+          <w:szCs w:val="16"/>
+        </w:rPr>
+      </w:pPr>
+      <w:r>
+        <w:rPr>
+          <w:rFonts w:ascii="Consolas" w:hAnsi="Consolas"/>
+          <w:noProof/>
+          <w:sz w:val="16"/>
+          <w:szCs w:val="16"/>
+        </w:rPr>
+        <w:t xml:space="preserve">              ├── sample_count</w:t>
+      </w:r>
+    </w:p>
+    <w:p>
+      <w:pPr>
+        <w:spacing w:after="0" w:line="240" w:lineRule="auto"/>
+        <w:rPr>
+          <w:rFonts w:ascii="Consolas" w:hAnsi="Consolas"/>
+          <w:noProof/>
+          <w:sz w:val="16"/>
+          <w:szCs w:val="16"/>
           <w:lang w:val="en-US"/>
         </w:rPr>
       </w:pPr>
@@ -1313,8 +1492,83 @@
           <w:noProof/>
           <w:sz w:val="16"/>
           <w:szCs w:val="16"/>
+        </w:rPr>
+        <w:t xml:space="preserve">              </w:t>
+      </w:r>
+      <w:r>
+        <w:rPr>
+          <w:rFonts w:ascii="Consolas" w:hAnsi="Consolas"/>
+          <w:noProof/>
+          <w:sz w:val="16"/>
+          <w:szCs w:val="16"/>
           <w:lang w:val="en-US"/>
         </w:rPr>
+        <w:t>├── sample_interval</w:t>
+      </w:r>
+    </w:p>
+    <w:p>
+      <w:pPr>
+        <w:spacing w:after="0" w:line="240" w:lineRule="auto"/>
+        <w:rPr>
+          <w:rFonts w:ascii="Consolas" w:hAnsi="Consolas"/>
+          <w:noProof/>
+          <w:sz w:val="16"/>
+          <w:szCs w:val="16"/>
+          <w:lang w:val="en-US"/>
+        </w:rPr>
+      </w:pPr>
+      <w:r>
+        <w:rPr>
+          <w:rFonts w:ascii="Consolas" w:hAnsi="Consolas"/>
+          <w:noProof/>
+          <w:sz w:val="16"/>
+          <w:szCs w:val="16"/>
+          <w:lang w:val="en-US"/>
+        </w:rPr>
+        <w:t xml:space="preserve">              └── record_length</w:t>
+      </w:r>
+    </w:p>
+    <w:p>
+      <w:pPr>
+        <w:spacing w:after="0" w:line="240" w:lineRule="auto"/>
+        <w:rPr>
+          <w:rFonts w:ascii="Consolas" w:hAnsi="Consolas"/>
+          <w:noProof/>
+          <w:sz w:val="16"/>
+          <w:szCs w:val="16"/>
+          <w:lang w:val="en-US"/>
+        </w:rPr>
+      </w:pPr>
+      <w:r>
+        <w:rPr>
+          <w:rFonts w:ascii="Consolas" w:hAnsi="Consolas"/>
+          <w:noProof/>
+          <w:sz w:val="16"/>
+          <w:szCs w:val="16"/>
+          <w:lang w:val="en-US"/>
+        </w:rPr>
+        <w:t xml:space="preserve">              │</w:t>
+      </w:r>
+    </w:p>
+    <w:p>
+      <w:pPr>
+        <w:spacing w:after="0" w:line="240" w:lineRule="auto"/>
+        <w:rPr>
+          <w:rFonts w:ascii="Consolas" w:hAnsi="Consolas"/>
+          <w:noProof/>
+          <w:sz w:val="16"/>
+          <w:szCs w:val="16"/>
+          <w:lang w:val="en-US"/>
+        </w:rPr>
+      </w:pPr>
+      <w:r>
+        <w:rPr>
+          <w:rFonts w:ascii="Consolas" w:hAnsi="Consolas"/>
+          <w:noProof/>
+          <w:sz w:val="16"/>
+          <w:szCs w:val="16"/>
+          <w:lang w:val="en-US"/>
+        </w:rPr>
         <w:t xml:space="preserve">              ▼</w:t>
       </w:r>
     </w:p>
@@ -1337,20 +1591,12 @@
           <w:szCs w:val="16"/>
           <w:lang w:val="en-US"/>
         </w:rPr>
-        <w:t xml:space="preserve">        use_cases.open(path)</w:t>
-      </w:r>
-    </w:p>
-    <w:p>
-      <w:pPr>
-        <w:spacing w:after="0" w:line="240" w:lineRule="auto"/>
-        <w:rPr>
-          <w:rFonts w:ascii="Consolas" w:hAnsi="Consolas"/>
-          <w:noProof/>
-          <w:sz w:val="16"/>
-          <w:szCs w:val="16"/>
-        </w:rPr>
-      </w:pPr>
-      <w:r>
+        <w:t xml:space="preserve">        configura viewport</w:t>
+      </w:r>
+    </w:p>
+    <w:p>
+      <w:pPr>
+        <w:spacing w:after="0" w:line="240" w:lineRule="auto"/>
         <w:rPr>
           <w:rFonts w:ascii="Consolas" w:hAnsi="Consolas"/>
           <w:noProof/>
@@ -1358,6 +1604,146 @@
           <w:szCs w:val="16"/>
           <w:lang w:val="en-US"/>
         </w:rPr>
+      </w:pPr>
+      <w:r>
+        <w:rPr>
+          <w:rFonts w:ascii="Consolas" w:hAnsi="Consolas"/>
+          <w:noProof/>
+          <w:sz w:val="16"/>
+          <w:szCs w:val="16"/>
+          <w:lang w:val="en-US"/>
+        </w:rPr>
+        <w:t xml:space="preserve">              │</w:t>
+      </w:r>
+    </w:p>
+    <w:p>
+      <w:pPr>
+        <w:spacing w:after="0" w:line="240" w:lineRule="auto"/>
+        <w:rPr>
+          <w:rFonts w:ascii="Consolas" w:hAnsi="Consolas"/>
+          <w:noProof/>
+          <w:sz w:val="16"/>
+          <w:szCs w:val="16"/>
+          <w:lang w:val="en-US"/>
+        </w:rPr>
+      </w:pPr>
+      <w:r>
+        <w:rPr>
+          <w:rFonts w:ascii="Consolas" w:hAnsi="Consolas"/>
+          <w:noProof/>
+          <w:sz w:val="16"/>
+          <w:szCs w:val="16"/>
+          <w:lang w:val="en-US"/>
+        </w:rPr>
+        <w:t xml:space="preserve">              ▼</w:t>
+      </w:r>
+    </w:p>
+    <w:p>
+      <w:pPr>
+        <w:spacing w:after="0" w:line="240" w:lineRule="auto"/>
+        <w:rPr>
+          <w:rFonts w:ascii="Consolas" w:hAnsi="Consolas"/>
+          <w:noProof/>
+          <w:sz w:val="16"/>
+          <w:szCs w:val="16"/>
+          <w:lang w:val="en-US"/>
+        </w:rPr>
+      </w:pPr>
+      <w:r>
+        <w:rPr>
+          <w:rFonts w:ascii="Consolas" w:hAnsi="Consolas"/>
+          <w:noProof/>
+          <w:sz w:val="16"/>
+          <w:szCs w:val="16"/>
+          <w:lang w:val="en-US"/>
+        </w:rPr>
+        <w:t xml:space="preserve">      _request_current_data()</w:t>
+      </w:r>
+    </w:p>
+    <w:p>
+      <w:pPr>
+        <w:spacing w:after="0" w:line="240" w:lineRule="auto"/>
+        <w:rPr>
+          <w:rFonts w:ascii="Consolas" w:hAnsi="Consolas"/>
+          <w:noProof/>
+          <w:sz w:val="16"/>
+          <w:szCs w:val="16"/>
+          <w:lang w:val="en-US"/>
+        </w:rPr>
+      </w:pPr>
+      <w:r>
+        <w:rPr>
+          <w:rFonts w:ascii="Consolas" w:hAnsi="Consolas"/>
+          <w:noProof/>
+          <w:sz w:val="16"/>
+          <w:szCs w:val="16"/>
+          <w:lang w:val="en-US"/>
+        </w:rPr>
+        <w:t xml:space="preserve">              │</w:t>
+      </w:r>
+    </w:p>
+    <w:p>
+      <w:pPr>
+        <w:spacing w:after="0" w:line="240" w:lineRule="auto"/>
+        <w:rPr>
+          <w:rFonts w:ascii="Consolas" w:hAnsi="Consolas"/>
+          <w:noProof/>
+          <w:sz w:val="16"/>
+          <w:szCs w:val="16"/>
+          <w:lang w:val="en-US"/>
+        </w:rPr>
+      </w:pPr>
+      <w:r>
+        <w:rPr>
+          <w:rFonts w:ascii="Consolas" w:hAnsi="Consolas"/>
+          <w:noProof/>
+          <w:sz w:val="16"/>
+          <w:szCs w:val="16"/>
+          <w:lang w:val="en-US"/>
+        </w:rPr>
+        <w:t xml:space="preserve">              ▼</w:t>
+      </w:r>
+    </w:p>
+    <w:p>
+      <w:pPr>
+        <w:spacing w:after="0" w:line="240" w:lineRule="auto"/>
+        <w:rPr>
+          <w:rFonts w:ascii="Consolas" w:hAnsi="Consolas"/>
+          <w:noProof/>
+          <w:sz w:val="16"/>
+          <w:szCs w:val="16"/>
+          <w:lang w:val="en-US"/>
+        </w:rPr>
+      </w:pPr>
+      <w:r>
+        <w:rPr>
+          <w:rFonts w:ascii="Consolas" w:hAnsi="Consolas"/>
+          <w:noProof/>
+          <w:sz w:val="16"/>
+          <w:szCs w:val="16"/>
+          <w:lang w:val="en-US"/>
+        </w:rPr>
+        <w:t xml:space="preserve">      use_cases.load_data(...)</w:t>
+      </w:r>
+    </w:p>
+    <w:p>
+      <w:pPr>
+        <w:spacing w:after="0" w:line="240" w:lineRule="auto"/>
+        <w:rPr>
+          <w:rFonts w:ascii="Consolas" w:hAnsi="Consolas"/>
+          <w:noProof/>
+          <w:sz w:val="16"/>
+          <w:szCs w:val="16"/>
+        </w:rPr>
+      </w:pPr>
+      <w:r>
+        <w:rPr>
+          <w:rFonts w:ascii="Consolas" w:hAnsi="Consolas"/>
+          <w:noProof/>
+          <w:sz w:val="16"/>
+          <w:szCs w:val="16"/>
+          <w:lang w:val="en-US"/>
+        </w:rPr>
         <w:t xml:space="preserve">              </w:t>
       </w:r>
       <w:r>
@@ -1407,7 +1793,7 @@
           <w:sz w:val="16"/>
           <w:szCs w:val="16"/>
         </w:rPr>
-        <w:t xml:space="preserve">       SeismicWindowInfoDTO</w:t>
+        <w:t xml:space="preserve">       SeismicDataBlockDTO</w:t>
       </w:r>
     </w:p>
     <w:p>
@@ -1447,123 +1833,6 @@
           <w:sz w:val="16"/>
           <w:szCs w:val="16"/>
         </w:rPr>
-        <w:t xml:space="preserve">              ├── trace_count</w:t>
-      </w:r>
-    </w:p>
-    <w:p>
-      <w:pPr>
-        <w:spacing w:after="0" w:line="240" w:lineRule="auto"/>
-        <w:rPr>
-          <w:rFonts w:ascii="Consolas" w:hAnsi="Consolas"/>
-          <w:noProof/>
-          <w:sz w:val="16"/>
-          <w:szCs w:val="16"/>
-        </w:rPr>
-      </w:pPr>
-      <w:r>
-        <w:rPr>
-          <w:rFonts w:ascii="Consolas" w:hAnsi="Consolas"/>
-          <w:noProof/>
-          <w:sz w:val="16"/>
-          <w:szCs w:val="16"/>
-        </w:rPr>
-        <w:t xml:space="preserve">              ├── sample_count</w:t>
-      </w:r>
-    </w:p>
-    <w:p>
-      <w:pPr>
-        <w:spacing w:after="0" w:line="240" w:lineRule="auto"/>
-        <w:rPr>
-          <w:rFonts w:ascii="Consolas" w:hAnsi="Consolas"/>
-          <w:noProof/>
-          <w:sz w:val="16"/>
-          <w:szCs w:val="16"/>
-          <w:lang w:val="en-US"/>
-        </w:rPr>
-      </w:pPr>
-      <w:r>
-        <w:rPr>
-          <w:rFonts w:ascii="Consolas" w:hAnsi="Consolas"/>
-          <w:noProof/>
-          <w:sz w:val="16"/>
-          <w:szCs w:val="16"/>
-        </w:rPr>
-        <w:t xml:space="preserve">              </w:t>
-      </w:r>
-      <w:r>
-        <w:rPr>
-          <w:rFonts w:ascii="Consolas" w:hAnsi="Consolas"/>
-          <w:noProof/>
-          <w:sz w:val="16"/>
-          <w:szCs w:val="16"/>
-          <w:lang w:val="en-US"/>
-        </w:rPr>
-        <w:t>├── sample_interval</w:t>
-      </w:r>
-    </w:p>
-    <w:p>
-      <w:pPr>
-        <w:spacing w:after="0" w:line="240" w:lineRule="auto"/>
-        <w:rPr>
-          <w:rFonts w:ascii="Consolas" w:hAnsi="Consolas"/>
-          <w:noProof/>
-          <w:sz w:val="16"/>
-          <w:szCs w:val="16"/>
-          <w:lang w:val="en-US"/>
-        </w:rPr>
-      </w:pPr>
-      <w:r>
-        <w:rPr>
-          <w:rFonts w:ascii="Consolas" w:hAnsi="Consolas"/>
-          <w:noProof/>
-          <w:sz w:val="16"/>
-          <w:szCs w:val="16"/>
-          <w:lang w:val="en-US"/>
-        </w:rPr>
-        <w:t xml:space="preserve">              └── record_length</w:t>
-      </w:r>
-    </w:p>
-    <w:p>
-      <w:pPr>
-        <w:spacing w:after="0" w:line="240" w:lineRule="auto"/>
-        <w:rPr>
-          <w:rFonts w:ascii="Consolas" w:hAnsi="Consolas"/>
-          <w:noProof/>
-          <w:sz w:val="16"/>
-          <w:szCs w:val="16"/>
-          <w:lang w:val="en-US"/>
-        </w:rPr>
-      </w:pPr>
-      <w:r>
-        <w:rPr>
-          <w:rFonts w:ascii="Consolas" w:hAnsi="Consolas"/>
-          <w:noProof/>
-          <w:sz w:val="16"/>
-          <w:szCs w:val="16"/>
-          <w:lang w:val="en-US"/>
-        </w:rPr>
-        <w:t xml:space="preserve">              │</w:t>
-      </w:r>
-    </w:p>
-    <w:p>
-      <w:pPr>
-        <w:spacing w:after="0" w:line="240" w:lineRule="auto"/>
-        <w:rPr>
-          <w:rFonts w:ascii="Consolas" w:hAnsi="Consolas"/>
-          <w:noProof/>
-          <w:sz w:val="16"/>
-          <w:szCs w:val="16"/>
-          <w:lang w:val="en-US"/>
-        </w:rPr>
-      </w:pPr>
-      <w:r>
-        <w:rPr>
-          <w:rFonts w:ascii="Consolas" w:hAnsi="Consolas"/>
-          <w:noProof/>
-          <w:sz w:val="16"/>
-          <w:szCs w:val="16"/>
-          <w:lang w:val="en-US"/>
-        </w:rPr>
         <w:t xml:space="preserve">              ▼</w:t>
       </w:r>
     </w:p>
@@ -1575,267 +1844,6 @@
           <w:noProof/>
           <w:sz w:val="16"/>
           <w:szCs w:val="16"/>
-          <w:lang w:val="en-US"/>
-        </w:rPr>
-      </w:pPr>
-      <w:r>
-        <w:rPr>
-          <w:rFonts w:ascii="Consolas" w:hAnsi="Consolas"/>
-          <w:noProof/>
-          <w:sz w:val="16"/>
-          <w:szCs w:val="16"/>
-          <w:lang w:val="en-US"/>
-        </w:rPr>
-        <w:t xml:space="preserve">        configura viewport</w:t>
-      </w:r>
-    </w:p>
-    <w:p>
-      <w:pPr>
-        <w:spacing w:after="0" w:line="240" w:lineRule="auto"/>
-        <w:rPr>
-          <w:rFonts w:ascii="Consolas" w:hAnsi="Consolas"/>
-          <w:noProof/>
-          <w:sz w:val="16"/>
-          <w:szCs w:val="16"/>
-          <w:lang w:val="en-US"/>
-        </w:rPr>
-      </w:pPr>
-      <w:r>
-        <w:rPr>
-          <w:rFonts w:ascii="Consolas" w:hAnsi="Consolas"/>
-          <w:noProof/>
-          <w:sz w:val="16"/>
-          <w:szCs w:val="16"/>
-          <w:lang w:val="en-US"/>
-        </w:rPr>
-        <w:t xml:space="preserve">              │</w:t>
-      </w:r>
-    </w:p>
-    <w:p>
-      <w:pPr>
-        <w:spacing w:after="0" w:line="240" w:lineRule="auto"/>
-        <w:rPr>
-          <w:rFonts w:ascii="Consolas" w:hAnsi="Consolas"/>
-          <w:noProof/>
-          <w:sz w:val="16"/>
-          <w:szCs w:val="16"/>
-          <w:lang w:val="en-US"/>
-        </w:rPr>
-      </w:pPr>
-      <w:r>
-        <w:rPr>
-          <w:rFonts w:ascii="Consolas" w:hAnsi="Consolas"/>
-          <w:noProof/>
-          <w:sz w:val="16"/>
-          <w:szCs w:val="16"/>
-          <w:lang w:val="en-US"/>
-        </w:rPr>
-        <w:t xml:space="preserve">              ▼</w:t>
-      </w:r>
-    </w:p>
-    <w:p>
-      <w:pPr>
-        <w:spacing w:after="0" w:line="240" w:lineRule="auto"/>
-        <w:rPr>
-          <w:rFonts w:ascii="Consolas" w:hAnsi="Consolas"/>
-          <w:noProof/>
-          <w:sz w:val="16"/>
-          <w:szCs w:val="16"/>
-          <w:lang w:val="en-US"/>
-        </w:rPr>
-      </w:pPr>
-      <w:r>
-        <w:rPr>
-          <w:rFonts w:ascii="Consolas" w:hAnsi="Consolas"/>
-          <w:noProof/>
-          <w:sz w:val="16"/>
-          <w:szCs w:val="16"/>
-          <w:lang w:val="en-US"/>
-        </w:rPr>
-        <w:t xml:space="preserve">      _request_current_data()</w:t>
-      </w:r>
-    </w:p>
-    <w:p>
-      <w:pPr>
-        <w:spacing w:after="0" w:line="240" w:lineRule="auto"/>
-        <w:rPr>
-          <w:rFonts w:ascii="Consolas" w:hAnsi="Consolas"/>
-          <w:noProof/>
-          <w:sz w:val="16"/>
-          <w:szCs w:val="16"/>
-          <w:lang w:val="en-US"/>
-        </w:rPr>
-      </w:pPr>
-      <w:r>
-        <w:rPr>
-          <w:rFonts w:ascii="Consolas" w:hAnsi="Consolas"/>
-          <w:noProof/>
-          <w:sz w:val="16"/>
-          <w:szCs w:val="16"/>
-          <w:lang w:val="en-US"/>
-        </w:rPr>
-        <w:t xml:space="preserve">              │</w:t>
-      </w:r>
-    </w:p>
-    <w:p>
-      <w:pPr>
-        <w:spacing w:after="0" w:line="240" w:lineRule="auto"/>
-        <w:rPr>
-          <w:rFonts w:ascii="Consolas" w:hAnsi="Consolas"/>
-          <w:noProof/>
-          <w:sz w:val="16"/>
-          <w:szCs w:val="16"/>
-          <w:lang w:val="en-US"/>
-        </w:rPr>
-      </w:pPr>
-      <w:r>
-        <w:rPr>
-          <w:rFonts w:ascii="Consolas" w:hAnsi="Consolas"/>
-          <w:noProof/>
-          <w:sz w:val="16"/>
-          <w:szCs w:val="16"/>
-          <w:lang w:val="en-US"/>
-        </w:rPr>
-        <w:t xml:space="preserve">              ▼</w:t>
-      </w:r>
-    </w:p>
-    <w:p>
-      <w:pPr>
-        <w:spacing w:after="0" w:line="240" w:lineRule="auto"/>
-        <w:rPr>
-          <w:rFonts w:ascii="Consolas" w:hAnsi="Consolas"/>
-          <w:noProof/>
-          <w:sz w:val="16"/>
-          <w:szCs w:val="16"/>
-          <w:lang w:val="en-US"/>
-        </w:rPr>
-      </w:pPr>
-      <w:r>
-        <w:rPr>
-          <w:rFonts w:ascii="Consolas" w:hAnsi="Consolas"/>
-          <w:noProof/>
-          <w:sz w:val="16"/>
-          <w:szCs w:val="16"/>
-          <w:lang w:val="en-US"/>
-        </w:rPr>
-        <w:t xml:space="preserve">      use_cases.load_data(...)</w:t>
-      </w:r>
-    </w:p>
-    <w:p>
-      <w:pPr>
-        <w:spacing w:after="0" w:line="240" w:lineRule="auto"/>
-        <w:rPr>
-          <w:rFonts w:ascii="Consolas" w:hAnsi="Consolas"/>
-          <w:noProof/>
-          <w:sz w:val="16"/>
-          <w:szCs w:val="16"/>
-        </w:rPr>
-      </w:pPr>
-      <w:r>
-        <w:rPr>
-          <w:rFonts w:ascii="Consolas" w:hAnsi="Consolas"/>
-          <w:noProof/>
-          <w:sz w:val="16"/>
-          <w:szCs w:val="16"/>
-          <w:lang w:val="en-US"/>
-        </w:rPr>
-        <w:t xml:space="preserve">              </w:t>
-      </w:r>
-      <w:r>
-        <w:rPr>
-          <w:rFonts w:ascii="Consolas" w:hAnsi="Consolas"/>
-          <w:noProof/>
-          <w:sz w:val="16"/>
-          <w:szCs w:val="16"/>
-        </w:rPr>
-        <w:t>│</w:t>
-      </w:r>
-    </w:p>
-    <w:p>
-      <w:pPr>
-        <w:spacing w:after="0" w:line="240" w:lineRule="auto"/>
-        <w:rPr>
-          <w:rFonts w:ascii="Consolas" w:hAnsi="Consolas"/>
-          <w:noProof/>
-          <w:sz w:val="16"/>
-          <w:szCs w:val="16"/>
-        </w:rPr>
-      </w:pPr>
-      <w:r>
-        <w:rPr>
-          <w:rFonts w:ascii="Consolas" w:hAnsi="Consolas"/>
-          <w:noProof/>
-          <w:sz w:val="16"/>
-          <w:szCs w:val="16"/>
-        </w:rPr>
-        <w:t xml:space="preserve">              ▼</w:t>
-      </w:r>
-    </w:p>
-    <w:p>
-      <w:pPr>
-        <w:spacing w:after="0" w:line="240" w:lineRule="auto"/>
-        <w:rPr>
-          <w:rFonts w:ascii="Consolas" w:hAnsi="Consolas"/>
-          <w:noProof/>
-          <w:sz w:val="16"/>
-          <w:szCs w:val="16"/>
-        </w:rPr>
-      </w:pPr>
-      <w:r>
-        <w:rPr>
-          <w:rFonts w:ascii="Consolas" w:hAnsi="Consolas"/>
-          <w:noProof/>
-          <w:sz w:val="16"/>
-          <w:szCs w:val="16"/>
-        </w:rPr>
-        <w:t xml:space="preserve">       SeismicDataBlockDTO</w:t>
-      </w:r>
-    </w:p>
-    <w:p>
-      <w:pPr>
-        <w:spacing w:after="0" w:line="240" w:lineRule="auto"/>
-        <w:rPr>
-          <w:rFonts w:ascii="Consolas" w:hAnsi="Consolas"/>
-          <w:noProof/>
-          <w:sz w:val="16"/>
-          <w:szCs w:val="16"/>
-        </w:rPr>
-      </w:pPr>
-      <w:r>
-        <w:rPr>
-          <w:rFonts w:ascii="Consolas" w:hAnsi="Consolas"/>
-          <w:noProof/>
-          <w:sz w:val="16"/>
-          <w:szCs w:val="16"/>
-        </w:rPr>
-        <w:t xml:space="preserve">              │</w:t>
-      </w:r>
-    </w:p>
-    <w:p>
-      <w:pPr>
-        <w:spacing w:after="0" w:line="240" w:lineRule="auto"/>
-        <w:rPr>
-          <w:rFonts w:ascii="Consolas" w:hAnsi="Consolas"/>
-          <w:noProof/>
-          <w:sz w:val="16"/>
-          <w:szCs w:val="16"/>
-        </w:rPr>
-      </w:pPr>
-      <w:r>
-        <w:rPr>
-          <w:rFonts w:ascii="Consolas" w:hAnsi="Consolas"/>
-          <w:noProof/>
-          <w:sz w:val="16"/>
-          <w:szCs w:val="16"/>
-        </w:rPr>
-        <w:t xml:space="preserve">              ▼</w:t>
-      </w:r>
-    </w:p>
-    <w:p>
-      <w:pPr>
-        <w:spacing w:after="0" w:line="240" w:lineRule="auto"/>
-        <w:rPr>
-          <w:noProof/>
         </w:rPr>
       </w:pPr>
       <w:r>
@@ -1847,12 +1855,161 @@
         </w:rPr>
         <w:t xml:space="preserve">        _distribute_data()</w:t>
       </w:r>
+    </w:p>
+    <w:p>
+      <w:pPr>
+        <w:spacing w:after="0" w:line="240" w:lineRule="auto"/>
+        <w:rPr>
+          <w:rFonts w:ascii="Consolas" w:hAnsi="Consolas"/>
+          <w:noProof/>
+          <w:sz w:val="16"/>
+          <w:szCs w:val="16"/>
+        </w:rPr>
+      </w:pPr>
+    </w:p>
+    <w:p>
+      <w:pPr>
+        <w:spacing w:after="0" w:line="240" w:lineRule="auto"/>
+        <w:rPr>
+          <w:rFonts w:ascii="Consolas" w:hAnsi="Consolas"/>
+          <w:noProof/>
+          <w:sz w:val="16"/>
+          <w:szCs w:val="16"/>
+        </w:rPr>
+      </w:pPr>
+    </w:p>
+    <w:p>
+      <w:pPr>
+        <w:spacing w:after="0" w:line="240" w:lineRule="auto"/>
+        <w:jc w:val="center"/>
+        <w:rPr>
+          <w:rFonts w:ascii="Consolas" w:hAnsi="Consolas"/>
+          <w:noProof/>
+          <w:sz w:val="16"/>
+          <w:szCs w:val="16"/>
+        </w:rPr>
+      </w:pPr>
+      <w:r>
+        <w:rPr>
+          <w:rFonts w:ascii="Consolas" w:hAnsi="Consolas"/>
+          <w:noProof/>
+          <w:sz w:val="16"/>
+          <w:szCs w:val="16"/>
+        </w:rPr>
+        <w:drawing>
+          <wp:inline distT="0" distB="0" distL="0" distR="0" wp14:anchorId="299ED51F" wp14:editId="441B88B7">
+            <wp:extent cx="3582538" cy="3582538"/>
+            <wp:effectExtent l="0" t="0" r="0" b="0"/>
+            <wp:docPr id="1197041645" name="Imagem 1"/>
+            <wp:cNvGraphicFramePr>
+              <a:graphicFrameLocks xmlns:a="http://schemas.openxmlformats.org/drawingml/2006/main" noChangeAspect="1"/>
+            </wp:cNvGraphicFramePr>
+            <a:graphic xmlns:a="http://schemas.openxmlformats.org/drawingml/2006/main">
+              <a:graphicData uri="http://schemas.openxmlformats.org/drawingml/2006/picture">
+                <pic:pic xmlns:pic="http://schemas.openxmlformats.org/drawingml/2006/picture">
+                  <pic:nvPicPr>
+                    <pic:cNvPr id="1197041645" name=""/>
+                    <pic:cNvPicPr/>
+                  </pic:nvPicPr>
+                  <pic:blipFill>
+                    <a:blip r:embed="rId14"/>
+                    <a:stretch>
+                      <a:fillRect/>
+                    </a:stretch>
+                  </pic:blipFill>
+                  <pic:spPr>
+                    <a:xfrm>
+                      <a:off x="0" y="0"/>
+                      <a:ext cx="3598161" cy="3598161"/>
+                    </a:xfrm>
+                    <a:prstGeom prst="rect">
+                      <a:avLst/>
+                    </a:prstGeom>
+                  </pic:spPr>
+                </pic:pic>
+              </a:graphicData>
+            </a:graphic>
+          </wp:inline>
+        </w:drawing>
+      </w:r>
+    </w:p>
+    <w:p>
+      <w:pPr>
+        <w:spacing w:after="0" w:line="240" w:lineRule="auto"/>
+        <w:jc w:val="center"/>
+        <w:rPr>
+          <w:rFonts w:ascii="Consolas" w:hAnsi="Consolas"/>
+          <w:noProof/>
+          <w:sz w:val="16"/>
+          <w:szCs w:val="16"/>
+        </w:rPr>
+      </w:pPr>
+      <w:r>
+        <w:rPr>
+          <w:rFonts w:ascii="Consolas" w:hAnsi="Consolas"/>
+          <w:noProof/>
+          <w:sz w:val="16"/>
+          <w:szCs w:val="16"/>
+        </w:rPr>
+        <w:lastRenderedPageBreak/>
+        <w:drawing>
+          <wp:inline distT="0" distB="0" distL="0" distR="0" wp14:anchorId="53FE8BCD" wp14:editId="67461A4D">
+            <wp:extent cx="3734321" cy="4686954"/>
+            <wp:effectExtent l="0" t="0" r="0" b="0"/>
+            <wp:docPr id="510006660" name="Imagem 1"/>
+            <wp:cNvGraphicFramePr>
+              <a:graphicFrameLocks xmlns:a="http://schemas.openxmlformats.org/drawingml/2006/main" noChangeAspect="1"/>
+            </wp:cNvGraphicFramePr>
+            <a:graphic xmlns:a="http://schemas.openxmlformats.org/drawingml/2006/main">
+              <a:graphicData uri="http://schemas.openxmlformats.org/drawingml/2006/picture">
+                <pic:pic xmlns:pic="http://schemas.openxmlformats.org/drawingml/2006/picture">
+                  <pic:nvPicPr>
+                    <pic:cNvPr id="510006660" name=""/>
+                    <pic:cNvPicPr/>
+                  </pic:nvPicPr>
+                  <pic:blipFill>
+                    <a:blip r:embed="rId15"/>
+                    <a:stretch>
+                      <a:fillRect/>
+                    </a:stretch>
+                  </pic:blipFill>
+                  <pic:spPr>
+                    <a:xfrm>
+                      <a:off x="0" y="0"/>
+                      <a:ext cx="3734321" cy="4686954"/>
+                    </a:xfrm>
+                    <a:prstGeom prst="rect">
+                      <a:avLst/>
+                    </a:prstGeom>
+                  </pic:spPr>
+                </pic:pic>
+              </a:graphicData>
+            </a:graphic>
+          </wp:inline>
+        </w:drawing>
+      </w:r>
+    </w:p>
+    <w:p>
+      <w:pPr>
+        <w:spacing w:after="0" w:line="240" w:lineRule="auto"/>
+        <w:rPr>
+          <w:noProof/>
+        </w:rPr>
+      </w:pPr>
       <w:r>
         <w:rPr>
           <w:noProof/>
         </w:rPr>
         <w:br w:type="page"/>
       </w:r>
+    </w:p>
+    <w:p>
+      <w:pPr>
+        <w:spacing w:after="0" w:line="240" w:lineRule="auto"/>
+        <w:rPr>
+          <w:noProof/>
+        </w:rPr>
+      </w:pPr>
     </w:p>
     <w:p>
       <w:pPr>
@@ -1866,7 +2023,6 @@
         <w:rPr>
           <w:noProof/>
         </w:rPr>
-        <w:lastRenderedPageBreak/>
         <w:t>IDEIAS DE FUNCIONALIDADES</w:t>
       </w:r>
     </w:p>
@@ -2026,7 +2182,7 @@
                     <pic:cNvPicPr/>
                   </pic:nvPicPr>
                   <pic:blipFill>
-                    <a:blip r:embed="rId14" cstate="print">
+                    <a:blip r:embed="rId16" cstate="print">
                       <a:extLst>
                         <a:ext uri="{28A0092B-C50C-407E-A947-70E740481C1C}">
                           <a14:useLocalDpi xmlns:a14="http://schemas.microsoft.com/office/drawing/2010/main" val="0"/>
@@ -2093,7 +2249,7 @@
                     </pic:cNvPicPr>
                   </pic:nvPicPr>
                   <pic:blipFill>
-                    <a:blip r:embed="rId15">
+                    <a:blip r:embed="rId17">
                       <a:extLst>
                         <a:ext uri="{28A0092B-C50C-407E-A947-70E740481C1C}">
                           <a14:useLocalDpi xmlns:a14="http://schemas.microsoft.com/office/drawing/2010/main" val="0"/>
@@ -2144,8 +2300,21 @@
         </w:r>
       </w:fldSimple>
       <w:r>
-        <w:t>-Desenho inicial (croqui) da Seismic Data Window</w:t>
-      </w:r>
+        <w:t xml:space="preserve">-Desenho inicial (croqui) da </w:t>
+      </w:r>
+      <w:proofErr w:type="spellStart"/>
+      <w:r>
+        <w:t>Seismic</w:t>
+      </w:r>
+      <w:proofErr w:type="spellEnd"/>
+      <w:r>
+        <w:t xml:space="preserve"> Data </w:t>
+      </w:r>
+      <w:proofErr w:type="spellStart"/>
+      <w:r>
+        <w:t>Window</w:t>
+      </w:r>
+      <w:proofErr w:type="spellEnd"/>
     </w:p>
     <w:p/>
     <w:p>

</xml_diff>

<commit_message>
Inicio da criação das configurações da SeismicDataWindow, criação da classe SeismicDisplaySettings
</commit_message>
<xml_diff>
--- a/docs/Estrutura da Seismic Data Window.docx
+++ b/docs/Estrutura da Seismic Data Window.docx
@@ -26,7 +26,7 @@
           <w:noProof/>
         </w:rPr>
         <w:drawing>
-          <wp:inline distT="0" distB="0" distL="0" distR="0" wp14:anchorId="2CDC0CE0" wp14:editId="4AF40AFC">
+          <wp:inline distT="0" distB="0" distL="0" distR="0" wp14:anchorId="2CDC0CE0" wp14:editId="4194DFC6">
             <wp:extent cx="6108700" cy="3120957"/>
             <wp:effectExtent l="0" t="0" r="6350" b="3810"/>
             <wp:docPr id="1384609778" name="Imagem 1"/>
@@ -1353,6 +1353,7 @@
           <w:noProof/>
           <w:sz w:val="16"/>
           <w:szCs w:val="16"/>
+          <w:lang w:val="en-US"/>
         </w:rPr>
       </w:pPr>
       <w:r>
@@ -1371,6 +1372,7 @@
           <w:noProof/>
           <w:sz w:val="16"/>
           <w:szCs w:val="16"/>
+          <w:lang w:val="en-US"/>
         </w:rPr>
         <w:t>│</w:t>
       </w:r>
@@ -1383,14 +1385,16 @@
           <w:noProof/>
           <w:sz w:val="16"/>
           <w:szCs w:val="16"/>
-        </w:rPr>
-      </w:pPr>
-      <w:r>
-        <w:rPr>
-          <w:rFonts w:ascii="Consolas" w:hAnsi="Consolas"/>
-          <w:noProof/>
-          <w:sz w:val="16"/>
-          <w:szCs w:val="16"/>
+          <w:lang w:val="en-US"/>
+        </w:rPr>
+      </w:pPr>
+      <w:r>
+        <w:rPr>
+          <w:rFonts w:ascii="Consolas" w:hAnsi="Consolas"/>
+          <w:noProof/>
+          <w:sz w:val="16"/>
+          <w:szCs w:val="16"/>
+          <w:lang w:val="en-US"/>
         </w:rPr>
         <w:t xml:space="preserve">              ▼</w:t>
       </w:r>
@@ -1403,14 +1407,16 @@
           <w:noProof/>
           <w:sz w:val="16"/>
           <w:szCs w:val="16"/>
-        </w:rPr>
-      </w:pPr>
-      <w:r>
-        <w:rPr>
-          <w:rFonts w:ascii="Consolas" w:hAnsi="Consolas"/>
-          <w:noProof/>
-          <w:sz w:val="16"/>
-          <w:szCs w:val="16"/>
+          <w:lang w:val="en-US"/>
+        </w:rPr>
+      </w:pPr>
+      <w:r>
+        <w:rPr>
+          <w:rFonts w:ascii="Consolas" w:hAnsi="Consolas"/>
+          <w:noProof/>
+          <w:sz w:val="16"/>
+          <w:szCs w:val="16"/>
+          <w:lang w:val="en-US"/>
         </w:rPr>
         <w:t xml:space="preserve">       SeismicWindowInfoDTO</w:t>
       </w:r>
@@ -1423,14 +1429,16 @@
           <w:noProof/>
           <w:sz w:val="16"/>
           <w:szCs w:val="16"/>
-        </w:rPr>
-      </w:pPr>
-      <w:r>
-        <w:rPr>
-          <w:rFonts w:ascii="Consolas" w:hAnsi="Consolas"/>
-          <w:noProof/>
-          <w:sz w:val="16"/>
-          <w:szCs w:val="16"/>
+          <w:lang w:val="en-US"/>
+        </w:rPr>
+      </w:pPr>
+      <w:r>
+        <w:rPr>
+          <w:rFonts w:ascii="Consolas" w:hAnsi="Consolas"/>
+          <w:noProof/>
+          <w:sz w:val="16"/>
+          <w:szCs w:val="16"/>
+          <w:lang w:val="en-US"/>
         </w:rPr>
         <w:t xml:space="preserve">              │</w:t>
       </w:r>
@@ -1443,14 +1451,16 @@
           <w:noProof/>
           <w:sz w:val="16"/>
           <w:szCs w:val="16"/>
-        </w:rPr>
-      </w:pPr>
-      <w:r>
-        <w:rPr>
-          <w:rFonts w:ascii="Consolas" w:hAnsi="Consolas"/>
-          <w:noProof/>
-          <w:sz w:val="16"/>
-          <w:szCs w:val="16"/>
+          <w:lang w:val="en-US"/>
+        </w:rPr>
+      </w:pPr>
+      <w:r>
+        <w:rPr>
+          <w:rFonts w:ascii="Consolas" w:hAnsi="Consolas"/>
+          <w:noProof/>
+          <w:sz w:val="16"/>
+          <w:szCs w:val="16"/>
+          <w:lang w:val="en-US"/>
         </w:rPr>
         <w:t xml:space="preserve">              ├── trace_count</w:t>
       </w:r>
@@ -1463,14 +1473,16 @@
           <w:noProof/>
           <w:sz w:val="16"/>
           <w:szCs w:val="16"/>
-        </w:rPr>
-      </w:pPr>
-      <w:r>
-        <w:rPr>
-          <w:rFonts w:ascii="Consolas" w:hAnsi="Consolas"/>
-          <w:noProof/>
-          <w:sz w:val="16"/>
-          <w:szCs w:val="16"/>
+          <w:lang w:val="en-US"/>
+        </w:rPr>
+      </w:pPr>
+      <w:r>
+        <w:rPr>
+          <w:rFonts w:ascii="Consolas" w:hAnsi="Consolas"/>
+          <w:noProof/>
+          <w:sz w:val="16"/>
+          <w:szCs w:val="16"/>
+          <w:lang w:val="en-US"/>
         </w:rPr>
         <w:t xml:space="preserve">              ├── sample_count</w:t>
       </w:r>
@@ -1492,6 +1504,7 @@
           <w:noProof/>
           <w:sz w:val="16"/>
           <w:szCs w:val="16"/>
+          <w:lang w:val="en-US"/>
         </w:rPr>
         <w:t xml:space="preserve">              </w:t>
       </w:r>
@@ -1734,6 +1747,7 @@
           <w:noProof/>
           <w:sz w:val="16"/>
           <w:szCs w:val="16"/>
+          <w:lang w:val="en-US"/>
         </w:rPr>
       </w:pPr>
       <w:r>
@@ -1752,6 +1766,7 @@
           <w:noProof/>
           <w:sz w:val="16"/>
           <w:szCs w:val="16"/>
+          <w:lang w:val="en-US"/>
         </w:rPr>
         <w:t>│</w:t>
       </w:r>
@@ -1764,14 +1779,16 @@
           <w:noProof/>
           <w:sz w:val="16"/>
           <w:szCs w:val="16"/>
-        </w:rPr>
-      </w:pPr>
-      <w:r>
-        <w:rPr>
-          <w:rFonts w:ascii="Consolas" w:hAnsi="Consolas"/>
-          <w:noProof/>
-          <w:sz w:val="16"/>
-          <w:szCs w:val="16"/>
+          <w:lang w:val="en-US"/>
+        </w:rPr>
+      </w:pPr>
+      <w:r>
+        <w:rPr>
+          <w:rFonts w:ascii="Consolas" w:hAnsi="Consolas"/>
+          <w:noProof/>
+          <w:sz w:val="16"/>
+          <w:szCs w:val="16"/>
+          <w:lang w:val="en-US"/>
         </w:rPr>
         <w:t xml:space="preserve">              ▼</w:t>
       </w:r>
@@ -1784,14 +1801,16 @@
           <w:noProof/>
           <w:sz w:val="16"/>
           <w:szCs w:val="16"/>
-        </w:rPr>
-      </w:pPr>
-      <w:r>
-        <w:rPr>
-          <w:rFonts w:ascii="Consolas" w:hAnsi="Consolas"/>
-          <w:noProof/>
-          <w:sz w:val="16"/>
-          <w:szCs w:val="16"/>
+          <w:lang w:val="en-US"/>
+        </w:rPr>
+      </w:pPr>
+      <w:r>
+        <w:rPr>
+          <w:rFonts w:ascii="Consolas" w:hAnsi="Consolas"/>
+          <w:noProof/>
+          <w:sz w:val="16"/>
+          <w:szCs w:val="16"/>
+          <w:lang w:val="en-US"/>
         </w:rPr>
         <w:t xml:space="preserve">       SeismicDataBlockDTO</w:t>
       </w:r>
@@ -1804,14 +1823,16 @@
           <w:noProof/>
           <w:sz w:val="16"/>
           <w:szCs w:val="16"/>
-        </w:rPr>
-      </w:pPr>
-      <w:r>
-        <w:rPr>
-          <w:rFonts w:ascii="Consolas" w:hAnsi="Consolas"/>
-          <w:noProof/>
-          <w:sz w:val="16"/>
-          <w:szCs w:val="16"/>
+          <w:lang w:val="en-US"/>
+        </w:rPr>
+      </w:pPr>
+      <w:r>
+        <w:rPr>
+          <w:rFonts w:ascii="Consolas" w:hAnsi="Consolas"/>
+          <w:noProof/>
+          <w:sz w:val="16"/>
+          <w:szCs w:val="16"/>
+          <w:lang w:val="en-US"/>
         </w:rPr>
         <w:t xml:space="preserve">              │</w:t>
       </w:r>
@@ -1832,8 +1853,18 @@
           <w:noProof/>
           <w:sz w:val="16"/>
           <w:szCs w:val="16"/>
-        </w:rPr>
-        <w:t xml:space="preserve">              ▼</w:t>
+          <w:lang w:val="en-US"/>
+        </w:rPr>
+        <w:t xml:space="preserve">              </w:t>
+      </w:r>
+      <w:r>
+        <w:rPr>
+          <w:rFonts w:ascii="Consolas" w:hAnsi="Consolas"/>
+          <w:noProof/>
+          <w:sz w:val="16"/>
+          <w:szCs w:val="16"/>
+        </w:rPr>
+        <w:t>▼</w:t>
       </w:r>
     </w:p>
     <w:p>
@@ -1992,13 +2023,30 @@
     <w:p>
       <w:pPr>
         <w:spacing w:after="0" w:line="240" w:lineRule="auto"/>
-        <w:rPr>
-          <w:noProof/>
-        </w:rPr>
-      </w:pPr>
-      <w:r>
-        <w:rPr>
-          <w:noProof/>
+        <w:jc w:val="center"/>
+        <w:rPr>
+          <w:rFonts w:ascii="Consolas" w:hAnsi="Consolas"/>
+          <w:noProof/>
+          <w:sz w:val="16"/>
+          <w:szCs w:val="16"/>
+        </w:rPr>
+      </w:pPr>
+    </w:p>
+    <w:p>
+      <w:pPr>
+        <w:rPr>
+          <w:rFonts w:ascii="Consolas" w:hAnsi="Consolas"/>
+          <w:noProof/>
+          <w:sz w:val="16"/>
+          <w:szCs w:val="16"/>
+        </w:rPr>
+      </w:pPr>
+      <w:r>
+        <w:rPr>
+          <w:rFonts w:ascii="Consolas" w:hAnsi="Consolas"/>
+          <w:noProof/>
+          <w:sz w:val="16"/>
+          <w:szCs w:val="16"/>
         </w:rPr>
         <w:br w:type="page"/>
       </w:r>
@@ -2006,9 +2054,125 @@
     <w:p>
       <w:pPr>
         <w:spacing w:after="0" w:line="240" w:lineRule="auto"/>
-        <w:rPr>
-          <w:noProof/>
-        </w:rPr>
+        <w:jc w:val="center"/>
+        <w:rPr>
+          <w:rFonts w:ascii="Consolas" w:hAnsi="Consolas"/>
+          <w:noProof/>
+          <w:sz w:val="16"/>
+          <w:szCs w:val="16"/>
+        </w:rPr>
+        <w:sectPr>
+          <w:pgSz w:w="11906" w:h="16838"/>
+          <w:pgMar w:top="1134" w:right="1134" w:bottom="1134" w:left="1134" w:header="709" w:footer="709" w:gutter="0"/>
+          <w:cols w:space="708"/>
+          <w:docGrid w:linePitch="360"/>
+        </w:sectPr>
+      </w:pPr>
+    </w:p>
+    <w:p>
+      <w:pPr>
+        <w:spacing w:after="0" w:line="240" w:lineRule="auto"/>
+        <w:jc w:val="center"/>
+        <w:rPr>
+          <w:rFonts w:ascii="Consolas" w:hAnsi="Consolas"/>
+          <w:noProof/>
+          <w:sz w:val="16"/>
+          <w:szCs w:val="16"/>
+        </w:rPr>
+      </w:pPr>
+      <w:r>
+        <w:rPr>
+          <w:rFonts w:ascii="Consolas" w:hAnsi="Consolas"/>
+          <w:noProof/>
+          <w:sz w:val="16"/>
+          <w:szCs w:val="16"/>
+        </w:rPr>
+        <w:lastRenderedPageBreak/>
+        <w:t>Resultado em 22/09/2026</w:t>
+      </w:r>
+    </w:p>
+    <w:p>
+      <w:pPr>
+        <w:spacing w:after="0" w:line="240" w:lineRule="auto"/>
+        <w:jc w:val="center"/>
+        <w:rPr>
+          <w:rFonts w:ascii="Consolas" w:hAnsi="Consolas"/>
+          <w:noProof/>
+          <w:sz w:val="16"/>
+          <w:szCs w:val="16"/>
+        </w:rPr>
+      </w:pPr>
+      <w:r>
+        <w:rPr>
+          <w:rFonts w:ascii="Consolas" w:hAnsi="Consolas"/>
+          <w:noProof/>
+          <w:sz w:val="16"/>
+          <w:szCs w:val="16"/>
+        </w:rPr>
+        <w:drawing>
+          <wp:inline distT="0" distB="0" distL="0" distR="0" wp14:anchorId="41F0ABDB" wp14:editId="42FAED13">
+            <wp:extent cx="9231080" cy="4961299"/>
+            <wp:effectExtent l="0" t="0" r="8255" b="0"/>
+            <wp:docPr id="1533199624" name="Imagem 1"/>
+            <wp:cNvGraphicFramePr>
+              <a:graphicFrameLocks xmlns:a="http://schemas.openxmlformats.org/drawingml/2006/main" noChangeAspect="1"/>
+            </wp:cNvGraphicFramePr>
+            <a:graphic xmlns:a="http://schemas.openxmlformats.org/drawingml/2006/main">
+              <a:graphicData uri="http://schemas.openxmlformats.org/drawingml/2006/picture">
+                <pic:pic xmlns:pic="http://schemas.openxmlformats.org/drawingml/2006/picture">
+                  <pic:nvPicPr>
+                    <pic:cNvPr id="1533199624" name=""/>
+                    <pic:cNvPicPr/>
+                  </pic:nvPicPr>
+                  <pic:blipFill>
+                    <a:blip r:embed="rId16"/>
+                    <a:stretch>
+                      <a:fillRect/>
+                    </a:stretch>
+                  </pic:blipFill>
+                  <pic:spPr>
+                    <a:xfrm>
+                      <a:off x="0" y="0"/>
+                      <a:ext cx="9252752" cy="4972947"/>
+                    </a:xfrm>
+                    <a:prstGeom prst="rect">
+                      <a:avLst/>
+                    </a:prstGeom>
+                  </pic:spPr>
+                </pic:pic>
+              </a:graphicData>
+            </a:graphic>
+          </wp:inline>
+        </w:drawing>
+      </w:r>
+    </w:p>
+    <w:p>
+      <w:pPr>
+        <w:spacing w:after="0" w:line="240" w:lineRule="auto"/>
+        <w:rPr>
+          <w:rFonts w:ascii="Consolas" w:hAnsi="Consolas"/>
+          <w:noProof/>
+          <w:sz w:val="16"/>
+          <w:szCs w:val="16"/>
+        </w:rPr>
+      </w:pPr>
+    </w:p>
+    <w:p>
+      <w:pPr>
+        <w:spacing w:after="0" w:line="240" w:lineRule="auto"/>
+        <w:jc w:val="center"/>
+        <w:rPr>
+          <w:rFonts w:ascii="Consolas" w:hAnsi="Consolas"/>
+          <w:noProof/>
+          <w:sz w:val="16"/>
+          <w:szCs w:val="16"/>
+        </w:rPr>
+        <w:sectPr>
+          <w:pgSz w:w="16838" w:h="11906" w:orient="landscape"/>
+          <w:pgMar w:top="1134" w:right="1134" w:bottom="1134" w:left="1134" w:header="709" w:footer="709" w:gutter="0"/>
+          <w:cols w:space="708"/>
+          <w:docGrid w:linePitch="360"/>
+        </w:sectPr>
       </w:pPr>
     </w:p>
     <w:p>
@@ -2023,6 +2187,144 @@
         <w:rPr>
           <w:noProof/>
         </w:rPr>
+        <w:lastRenderedPageBreak/>
+        <w:t>OPCOES PARA DESENHO DO TRACO SÍSMICO</w:t>
+      </w:r>
+    </w:p>
+    <w:p>
+      <w:pPr>
+        <w:ind w:firstLine="567"/>
+        <w:rPr>
+          <w:noProof/>
+        </w:rPr>
+      </w:pPr>
+      <w:r>
+        <w:rPr>
+          <w:noProof/>
+        </w:rPr>
+        <w:drawing>
+          <wp:inline distT="0" distB="0" distL="0" distR="0" wp14:anchorId="0F241150" wp14:editId="76499988">
+            <wp:extent cx="1032844" cy="1112293"/>
+            <wp:effectExtent l="0" t="0" r="0" b="0"/>
+            <wp:docPr id="138382835" name="Imagem 1"/>
+            <wp:cNvGraphicFramePr>
+              <a:graphicFrameLocks xmlns:a="http://schemas.openxmlformats.org/drawingml/2006/main" noChangeAspect="1"/>
+            </wp:cNvGraphicFramePr>
+            <a:graphic xmlns:a="http://schemas.openxmlformats.org/drawingml/2006/main">
+              <a:graphicData uri="http://schemas.openxmlformats.org/drawingml/2006/picture">
+                <pic:pic xmlns:pic="http://schemas.openxmlformats.org/drawingml/2006/picture">
+                  <pic:nvPicPr>
+                    <pic:cNvPr id="138382835" name=""/>
+                    <pic:cNvPicPr/>
+                  </pic:nvPicPr>
+                  <pic:blipFill>
+                    <a:blip r:embed="rId17"/>
+                    <a:stretch>
+                      <a:fillRect/>
+                    </a:stretch>
+                  </pic:blipFill>
+                  <pic:spPr>
+                    <a:xfrm>
+                      <a:off x="0" y="0"/>
+                      <a:ext cx="1035373" cy="1115017"/>
+                    </a:xfrm>
+                    <a:prstGeom prst="rect">
+                      <a:avLst/>
+                    </a:prstGeom>
+                  </pic:spPr>
+                </pic:pic>
+              </a:graphicData>
+            </a:graphic>
+          </wp:inline>
+        </w:drawing>
+      </w:r>
+      <w:r>
+        <w:rPr>
+          <w:noProof/>
+        </w:rPr>
+        <w:t>Opcoes do Seisee</w:t>
+      </w:r>
+    </w:p>
+    <w:p>
+      <w:pPr>
+        <w:ind w:firstLine="567"/>
+        <w:rPr>
+          <w:noProof/>
+        </w:rPr>
+      </w:pPr>
+      <w:r>
+        <w:rPr>
+          <w:noProof/>
+        </w:rPr>
+        <w:drawing>
+          <wp:inline distT="0" distB="0" distL="0" distR="0" wp14:anchorId="2FB46664" wp14:editId="36C8D721">
+            <wp:extent cx="2238687" cy="1390844"/>
+            <wp:effectExtent l="0" t="0" r="9525" b="0"/>
+            <wp:docPr id="1401936839" name="Imagem 1"/>
+            <wp:cNvGraphicFramePr>
+              <a:graphicFrameLocks xmlns:a="http://schemas.openxmlformats.org/drawingml/2006/main" noChangeAspect="1"/>
+            </wp:cNvGraphicFramePr>
+            <a:graphic xmlns:a="http://schemas.openxmlformats.org/drawingml/2006/main">
+              <a:graphicData uri="http://schemas.openxmlformats.org/drawingml/2006/picture">
+                <pic:pic xmlns:pic="http://schemas.openxmlformats.org/drawingml/2006/picture">
+                  <pic:nvPicPr>
+                    <pic:cNvPr id="1401936839" name=""/>
+                    <pic:cNvPicPr/>
+                  </pic:nvPicPr>
+                  <pic:blipFill>
+                    <a:blip r:embed="rId18"/>
+                    <a:stretch>
+                      <a:fillRect/>
+                    </a:stretch>
+                  </pic:blipFill>
+                  <pic:spPr>
+                    <a:xfrm>
+                      <a:off x="0" y="0"/>
+                      <a:ext cx="2238687" cy="1390844"/>
+                    </a:xfrm>
+                    <a:prstGeom prst="rect">
+                      <a:avLst/>
+                    </a:prstGeom>
+                  </pic:spPr>
+                </pic:pic>
+              </a:graphicData>
+            </a:graphic>
+          </wp:inline>
+        </w:drawing>
+      </w:r>
+      <w:r>
+        <w:rPr>
+          <w:noProof/>
+        </w:rPr>
+        <w:t>Opcoes do Vista</w:t>
+      </w:r>
+    </w:p>
+    <w:p>
+      <w:pPr>
+        <w:rPr>
+          <w:noProof/>
+        </w:rPr>
+      </w:pPr>
+      <w:r>
+        <w:rPr>
+          <w:noProof/>
+        </w:rPr>
+        <w:br w:type="page"/>
+      </w:r>
+    </w:p>
+    <w:p>
+      <w:pPr>
+        <w:ind w:firstLine="567"/>
+        <w:jc w:val="center"/>
+        <w:rPr>
+          <w:noProof/>
+        </w:rPr>
+      </w:pPr>
+      <w:r>
+        <w:rPr>
+          <w:noProof/>
+        </w:rPr>
+        <w:lastRenderedPageBreak/>
         <w:t>IDEIAS DE FUNCIONALIDADES</w:t>
       </w:r>
     </w:p>
@@ -2182,7 +2484,7 @@
                     <pic:cNvPicPr/>
                   </pic:nvPicPr>
                   <pic:blipFill>
-                    <a:blip r:embed="rId16" cstate="print">
+                    <a:blip r:embed="rId19" cstate="print">
                       <a:extLst>
                         <a:ext uri="{28A0092B-C50C-407E-A947-70E740481C1C}">
                           <a14:useLocalDpi xmlns:a14="http://schemas.microsoft.com/office/drawing/2010/main" val="0"/>
@@ -2249,7 +2551,7 @@
                     </pic:cNvPicPr>
                   </pic:nvPicPr>
                   <pic:blipFill>
-                    <a:blip r:embed="rId17">
+                    <a:blip r:embed="rId20">
                       <a:extLst>
                         <a:ext uri="{28A0092B-C50C-407E-A947-70E740481C1C}">
                           <a14:useLocalDpi xmlns:a14="http://schemas.microsoft.com/office/drawing/2010/main" val="0"/>
@@ -3443,6 +3745,7 @@
   <w:style w:type="character" w:default="1" w:styleId="Fontepargpadro">
     <w:name w:val="Default Paragraph Font"/>
     <w:uiPriority w:val="1"/>
+    <w:semiHidden/>
     <w:unhideWhenUsed/>
   </w:style>
   <w:style w:type="table" w:default="1" w:styleId="Tabelanormal">

</xml_diff>